<commit_message>
Add variant structure to lab 3
</commit_message>
<xml_diff>
--- a/LR3-VLAN-802.1Q/report.docx
+++ b/LR3-VLAN-802.1Q/report.docx
@@ -238,12 +238,12 @@
       <w:r>
         <w:t xml:space="preserve"> </w:t>
       </w:r>
-      <w:hyperlink w:anchor="Xbd118a2c8917c97c6573c06b583a6df6f00e826">
+      <w:hyperlink w:anchor="Xfd7991d7bbf07c3c9957e001a0f8b8d6e97bcdf">
         <w:r>
           <w:rPr>
             <w:rStyle w:val="Hyperlink"/>
           </w:rPr>
-          <w:t xml:space="preserve">Задание 1. Изучение схемы и адресного плана</w:t>
+          <w:t xml:space="preserve">Задание 1. Определение варианта и изучение схемы</w:t>
         </w:r>
       </w:hyperlink>
       <w:r>
@@ -255,12 +255,12 @@
       <w:r>
         <w:t xml:space="preserve"> </w:t>
       </w:r>
-      <w:hyperlink w:anchor="задание-2-анализ-трафика-vlan-10">
+      <w:hyperlink w:anchor="X3bbbf988f8fe36944d39d8634602395d2b92c39">
         <w:r>
           <w:rPr>
             <w:rStyle w:val="Hyperlink"/>
           </w:rPr>
-          <w:t xml:space="preserve">Задание 2. Анализ трафика VLAN 10</w:t>
+          <w:t xml:space="preserve">Задание 2. Детальный анализ последовательности по варианту</w:t>
         </w:r>
       </w:hyperlink>
       <w:r>
@@ -272,12 +272,12 @@
       <w:r>
         <w:t xml:space="preserve"> </w:t>
       </w:r>
-      <w:hyperlink w:anchor="задание-3-анализ-трафика-vlan-20">
+      <w:hyperlink w:anchor="Xe34fe7dfef7e69b276ec32bfd701081a7f544d2">
         <w:r>
           <w:rPr>
             <w:rStyle w:val="Hyperlink"/>
           </w:rPr>
-          <w:t xml:space="preserve">Задание 3. Анализ трафика VLAN 20</w:t>
+          <w:t xml:space="preserve">Задание 3. Анализ второй VLAN и сравнительный разбор</w:t>
         </w:r>
       </w:hyperlink>
       <w:r>
@@ -289,12 +289,12 @@
       <w:r>
         <w:t xml:space="preserve"> </w:t>
       </w:r>
-      <w:hyperlink w:anchor="задание-4-аналитическая-часть">
+      <w:hyperlink w:anchor="задание-4-итоговая-аналитическая-часть">
         <w:r>
           <w:rPr>
             <w:rStyle w:val="Hyperlink"/>
           </w:rPr>
-          <w:t xml:space="preserve">Задание 4. Аналитическая часть</w:t>
+          <w:t xml:space="preserve">Задание 4. Итоговая аналитическая часть</w:t>
         </w:r>
       </w:hyperlink>
     </w:p>
@@ -486,6 +486,75 @@
         </w:numPr>
       </w:pPr>
       <w:r>
+        <w:t xml:space="preserve">Сразу вычисли значения параметров</w:t>
+      </w:r>
+      <w:r>
+        <w:t xml:space="preserve"> </w:t>
+      </w:r>
+      <w:r>
+        <w:rPr>
+          <w:rStyle w:val="VerbatimChar"/>
+        </w:rPr>
+        <w:t xml:space="preserve">A</w:t>
+      </w:r>
+      <w:r>
+        <w:t xml:space="preserve">,</w:t>
+      </w:r>
+      <w:r>
+        <w:t xml:space="preserve"> </w:t>
+      </w:r>
+      <w:r>
+        <w:rPr>
+          <w:rStyle w:val="VerbatimChar"/>
+        </w:rPr>
+        <w:t xml:space="preserve">B</w:t>
+      </w:r>
+      <w:r>
+        <w:t xml:space="preserve"> </w:t>
+      </w:r>
+      <w:r>
+        <w:t xml:space="preserve">и</w:t>
+      </w:r>
+      <w:r>
+        <w:t xml:space="preserve"> </w:t>
+      </w:r>
+      <w:r>
+        <w:rPr>
+          <w:rStyle w:val="VerbatimChar"/>
+        </w:rPr>
+        <w:t xml:space="preserve">C</w:t>
+      </w:r>
+      <w:r>
+        <w:t xml:space="preserve"> </w:t>
+      </w:r>
+      <w:r>
+        <w:t xml:space="preserve">по номеру студента</w:t>
+      </w:r>
+      <w:r>
+        <w:t xml:space="preserve"> </w:t>
+      </w:r>
+      <w:r>
+        <w:rPr>
+          <w:rStyle w:val="VerbatimChar"/>
+        </w:rPr>
+        <w:t xml:space="preserve">N</w:t>
+      </w:r>
+      <w:r>
+        <w:t xml:space="preserve"> </w:t>
+      </w:r>
+      <w:r>
+        <w:t xml:space="preserve">и укажи их в начале отчёта.</w:t>
+      </w:r>
+    </w:p>
+    <w:p>
+      <w:pPr>
+        <w:pStyle w:val="Compact"/>
+        <w:numPr>
+          <w:ilvl w:val="0"/>
+          <w:numId w:val="1003"/>
+        </w:numPr>
+      </w:pPr>
+      <w:r>
         <w:t xml:space="preserve">Обязательная часть лабораторной выполняется по готовому файлу</w:t>
       </w:r>
       <w:r>
@@ -499,6 +568,18 @@
       </w:r>
       <w:r>
         <w:t xml:space="preserve">; самостоятельная настройка Open vSwitch, GNS3 VM, Docker, VirtualBox и VMware не требуется.</w:t>
+      </w:r>
+    </w:p>
+    <w:p>
+      <w:pPr>
+        <w:pStyle w:val="Compact"/>
+        <w:numPr>
+          <w:ilvl w:val="0"/>
+          <w:numId w:val="1003"/>
+        </w:numPr>
+      </w:pPr>
+      <w:r>
+        <w:t xml:space="preserve">В этой лабораторной варианты не меняют сам файл захвата и не меняют адресный план: они задают основную последовательность для детального разбора и аналитический акцент в отчёте.</w:t>
       </w:r>
     </w:p>
     <w:p>
@@ -2954,28 +3035,22 @@
         </w:numPr>
       </w:pPr>
       <w:r>
-        <w:t xml:space="preserve">минимум 4 скриншота Wireshark:</w:t>
-      </w:r>
-    </w:p>
-    <w:p>
-      <w:pPr>
-        <w:pStyle w:val="Compact"/>
-        <w:numPr>
-          <w:ilvl w:val="1"/>
-          <w:numId w:val="1015"/>
-        </w:numPr>
-      </w:pPr>
+        <w:t xml:space="preserve">номер студента</w:t>
+      </w:r>
+      <w:r>
+        <w:t xml:space="preserve"> </w:t>
+      </w:r>
       <w:r>
         <w:rPr>
           <w:rStyle w:val="VerbatimChar"/>
         </w:rPr>
-        <w:t xml:space="preserve">ARP Request</w:t>
+        <w:t xml:space="preserve">N</w:t>
       </w:r>
       <w:r>
         <w:t xml:space="preserve"> </w:t>
       </w:r>
       <w:r>
-        <w:t xml:space="preserve">и</w:t>
+        <w:t xml:space="preserve">и вычисленные значения параметров</w:t>
       </w:r>
       <w:r>
         <w:t xml:space="preserve"> </w:t>
@@ -2984,34 +3059,22 @@
         <w:rPr>
           <w:rStyle w:val="VerbatimChar"/>
         </w:rPr>
-        <w:t xml:space="preserve">ARP Reply</w:t>
+        <w:t xml:space="preserve">A</w:t>
+      </w:r>
+      <w:r>
+        <w:t xml:space="preserve">,</w:t>
       </w:r>
       <w:r>
         <w:t xml:space="preserve"> </w:t>
       </w:r>
-      <w:r>
-        <w:t xml:space="preserve">для одной VLAN;</w:t>
-      </w:r>
-    </w:p>
-    <w:p>
-      <w:pPr>
-        <w:pStyle w:val="Compact"/>
-        <w:numPr>
-          <w:ilvl w:val="1"/>
-          <w:numId w:val="1015"/>
-        </w:numPr>
-      </w:pPr>
       <w:r>
         <w:rPr>
           <w:rStyle w:val="VerbatimChar"/>
         </w:rPr>
-        <w:t xml:space="preserve">ICMP Echo Request</w:t>
-      </w:r>
-      <w:r>
-        <w:t xml:space="preserve"> </w:t>
-      </w:r>
-      <w:r>
-        <w:t xml:space="preserve">и</w:t>
+        <w:t xml:space="preserve">B</w:t>
+      </w:r>
+      <w:r>
+        <w:t xml:space="preserve">,</w:t>
       </w:r>
       <w:r>
         <w:t xml:space="preserve"> </w:t>
@@ -3020,13 +3083,10 @@
         <w:rPr>
           <w:rStyle w:val="VerbatimChar"/>
         </w:rPr>
-        <w:t xml:space="preserve">ICMP Echo Reply</w:t>
-      </w:r>
-      <w:r>
-        <w:t xml:space="preserve"> </w:t>
-      </w:r>
-      <w:r>
-        <w:t xml:space="preserve">для одной VLAN;</w:t>
+        <w:t xml:space="preserve">C</w:t>
+      </w:r>
+      <w:r>
+        <w:t xml:space="preserve">;</w:t>
       </w:r>
     </w:p>
     <w:p>
@@ -3038,7 +3098,19 @@
         </w:numPr>
       </w:pPr>
       <w:r>
-        <w:t xml:space="preserve">минимум 2 дополнительных скриншота Wireshark для второй VLAN;</w:t>
+        <w:t xml:space="preserve">минимум 4 скриншота Wireshark для основной последовательности по варианту</w:t>
+      </w:r>
+      <w:r>
+        <w:t xml:space="preserve"> </w:t>
+      </w:r>
+      <w:r>
+        <w:rPr>
+          <w:rStyle w:val="VerbatimChar"/>
+        </w:rPr>
+        <w:t xml:space="preserve">A</w:t>
+      </w:r>
+      <w:r>
+        <w:t xml:space="preserve">;</w:t>
       </w:r>
     </w:p>
     <w:p>
@@ -3050,22 +3122,7 @@
         </w:numPr>
       </w:pPr>
       <w:r>
-        <w:t xml:space="preserve">таблица анализа кадров с указанием номера кадра, MAC-адресов, IP-адресов,</w:t>
-      </w:r>
-      <w:r>
-        <w:t xml:space="preserve"> </w:t>
-      </w:r>
-      <w:r>
-        <w:rPr>
-          <w:rStyle w:val="VerbatimChar"/>
-        </w:rPr>
-        <w:t xml:space="preserve">VLAN ID</w:t>
-      </w:r>
-      <w:r>
-        <w:t xml:space="preserve"> </w:t>
-      </w:r>
-      <w:r>
-        <w:t xml:space="preserve">и протокола верхнего уровня;</w:t>
+        <w:t xml:space="preserve">минимум 2 дополнительных скриншота Wireshark для второй VLAN;</w:t>
       </w:r>
     </w:p>
     <w:p>
@@ -3077,6 +3134,81 @@
         </w:numPr>
       </w:pPr>
       <w:r>
+        <w:t xml:space="preserve">таблица анализа кадров с указанием номера кадра, MAC-адресов, IP-адресов,</w:t>
+      </w:r>
+      <w:r>
+        <w:t xml:space="preserve"> </w:t>
+      </w:r>
+      <w:r>
+        <w:rPr>
+          <w:rStyle w:val="VerbatimChar"/>
+        </w:rPr>
+        <w:t xml:space="preserve">VLAN ID</w:t>
+      </w:r>
+      <w:r>
+        <w:t xml:space="preserve"> </w:t>
+      </w:r>
+      <w:r>
+        <w:t xml:space="preserve">и протокола верхнего уровня;</w:t>
+      </w:r>
+    </w:p>
+    <w:p>
+      <w:pPr>
+        <w:pStyle w:val="Compact"/>
+        <w:numPr>
+          <w:ilvl w:val="0"/>
+          <w:numId w:val="1014"/>
+        </w:numPr>
+      </w:pPr>
+      <w:r>
+        <w:t xml:space="preserve">отдельный комментарий по варианту</w:t>
+      </w:r>
+      <w:r>
+        <w:t xml:space="preserve"> </w:t>
+      </w:r>
+      <w:r>
+        <w:rPr>
+          <w:rStyle w:val="VerbatimChar"/>
+        </w:rPr>
+        <w:t xml:space="preserve">B</w:t>
+      </w:r>
+      <w:r>
+        <w:t xml:space="preserve">;</w:t>
+      </w:r>
+    </w:p>
+    <w:p>
+      <w:pPr>
+        <w:pStyle w:val="Compact"/>
+        <w:numPr>
+          <w:ilvl w:val="0"/>
+          <w:numId w:val="1014"/>
+        </w:numPr>
+      </w:pPr>
+      <w:r>
+        <w:t xml:space="preserve">сравнительный комментарий по варианту</w:t>
+      </w:r>
+      <w:r>
+        <w:t xml:space="preserve"> </w:t>
+      </w:r>
+      <w:r>
+        <w:rPr>
+          <w:rStyle w:val="VerbatimChar"/>
+        </w:rPr>
+        <w:t xml:space="preserve">C</w:t>
+      </w:r>
+      <w:r>
+        <w:t xml:space="preserve">;</w:t>
+      </w:r>
+    </w:p>
+    <w:p>
+      <w:pPr>
+        <w:pStyle w:val="Compact"/>
+        <w:numPr>
+          <w:ilvl w:val="0"/>
+          <w:numId w:val="1014"/>
+        </w:numPr>
+      </w:pPr>
+      <w:r>
         <w:t xml:space="preserve">краткий аналитический вывод.</w:t>
       </w:r>
     </w:p>
@@ -3086,6 +3218,141 @@
       </w:pPr>
       <w:r>
         <w:t xml:space="preserve">Дополнительно необходимо учитывать следующее:</w:t>
+      </w:r>
+    </w:p>
+    <w:p>
+      <w:pPr>
+        <w:pStyle w:val="Compact"/>
+        <w:numPr>
+          <w:ilvl w:val="0"/>
+          <w:numId w:val="1015"/>
+        </w:numPr>
+      </w:pPr>
+      <w:r>
+        <w:t xml:space="preserve">на скриншоте trunk-кадра должны быть видны и список пакетов, и разбор поля</w:t>
+      </w:r>
+      <w:r>
+        <w:t xml:space="preserve"> </w:t>
+      </w:r>
+      <w:r>
+        <w:rPr>
+          <w:rStyle w:val="VerbatimChar"/>
+        </w:rPr>
+        <w:t xml:space="preserve">802.1Q</w:t>
+      </w:r>
+      <w:r>
+        <w:t xml:space="preserve">, и байтовое представление;</w:t>
+      </w:r>
+    </w:p>
+    <w:p>
+      <w:pPr>
+        <w:pStyle w:val="Compact"/>
+        <w:numPr>
+          <w:ilvl w:val="0"/>
+          <w:numId w:val="1015"/>
+        </w:numPr>
+      </w:pPr>
+      <w:r>
+        <w:t xml:space="preserve">в таблице анализа нужно явно указать, какая последовательность является основной по варианту</w:t>
+      </w:r>
+      <w:r>
+        <w:t xml:space="preserve"> </w:t>
+      </w:r>
+      <w:r>
+        <w:rPr>
+          <w:rStyle w:val="VerbatimChar"/>
+        </w:rPr>
+        <w:t xml:space="preserve">A</w:t>
+      </w:r>
+      <w:r>
+        <w:t xml:space="preserve">, а какая относится ко второй VLAN;</w:t>
+      </w:r>
+    </w:p>
+    <w:p>
+      <w:pPr>
+        <w:pStyle w:val="Compact"/>
+        <w:numPr>
+          <w:ilvl w:val="0"/>
+          <w:numId w:val="1015"/>
+        </w:numPr>
+      </w:pPr>
+      <w:r>
+        <w:t xml:space="preserve">в приложениях к отчёту должен присутствовать файл</w:t>
+      </w:r>
+      <w:r>
+        <w:t xml:space="preserve"> </w:t>
+      </w:r>
+      <w:r>
+        <w:rPr>
+          <w:rStyle w:val="VerbatimChar"/>
+        </w:rPr>
+        <w:t xml:space="preserve">pcap/lr3_vlan_trunk_demo.pcapng</w:t>
+      </w:r>
+      <w:r>
+        <w:t xml:space="preserve">.</w:t>
+      </w:r>
+    </w:p>
+    <w:bookmarkEnd w:id="42"/>
+    <w:bookmarkEnd w:id="43"/>
+    <w:bookmarkStart w:id="48" w:name="chapter-iv"/>
+    <w:p>
+      <w:pPr>
+        <w:pStyle w:val="Heading2"/>
+      </w:pPr>
+      <w:r>
+        <w:t xml:space="preserve">Chapter IV</w:t>
+      </w:r>
+    </w:p>
+    <w:bookmarkStart w:id="44" w:name="Xfd7991d7bbf07c3c9957e001a0f8b8d6e97bcdf"/>
+    <w:p>
+      <w:pPr>
+        <w:pStyle w:val="Heading3"/>
+      </w:pPr>
+      <w:r>
+        <w:t xml:space="preserve">Задание 1. Определение варианта и изучение схемы</w:t>
+      </w:r>
+    </w:p>
+    <w:p>
+      <w:pPr>
+        <w:pStyle w:val="FirstParagraph"/>
+      </w:pPr>
+      <w:r>
+        <w:t xml:space="preserve">В данной лабораторной работе варианты не меняют исходный файл</w:t>
+      </w:r>
+      <w:r>
+        <w:t xml:space="preserve"> </w:t>
+      </w:r>
+      <w:r>
+        <w:rPr>
+          <w:rStyle w:val="VerbatimChar"/>
+        </w:rPr>
+        <w:t xml:space="preserve">pcap/lr3_vlan_trunk_demo.pcapng</w:t>
+      </w:r>
+      <w:r>
+        <w:t xml:space="preserve"> </w:t>
+      </w:r>
+      <w:r>
+        <w:t xml:space="preserve">и не меняют таблицу адресации. Вариант определяет, какая последовательность считается основной для детального разбора и на каком типе кадров студент делает основной акцент в отчёте.</w:t>
+      </w:r>
+    </w:p>
+    <w:p>
+      <w:pPr>
+        <w:pStyle w:val="BodyText"/>
+      </w:pPr>
+      <w:r>
+        <w:t xml:space="preserve">Для этого задания используется параметр</w:t>
+      </w:r>
+      <w:r>
+        <w:t xml:space="preserve"> </w:t>
+      </w:r>
+      <w:r>
+        <w:rPr>
+          <w:rStyle w:val="VerbatimChar"/>
+        </w:rPr>
+        <w:t xml:space="preserve">A</w:t>
+      </w:r>
+      <w:r>
+        <w:t xml:space="preserve">, который вычисляется по формуле:</w:t>
       </w:r>
     </w:p>
     <w:p>
@@ -3097,31 +3364,18 @@
         </w:numPr>
       </w:pPr>
       <w:r>
-        <w:t xml:space="preserve">на скриншоте trunk-кадра должны быть видны и список пакетов, и разбор поля</w:t>
-      </w:r>
-      <w:r>
-        <w:t xml:space="preserve"> </w:t>
-      </w:r>
-      <w:r>
         <w:rPr>
           <w:rStyle w:val="VerbatimChar"/>
         </w:rPr>
-        <w:t xml:space="preserve">802.1Q</w:t>
-      </w:r>
-      <w:r>
-        <w:t xml:space="preserve">, и байтовое представление;</w:t>
-      </w:r>
-    </w:p>
-    <w:p>
-      <w:pPr>
-        <w:pStyle w:val="Compact"/>
-        <w:numPr>
-          <w:ilvl w:val="0"/>
-          <w:numId w:val="1016"/>
-        </w:numPr>
-      </w:pPr>
-      <w:r>
-        <w:t xml:space="preserve">в таблице анализа нужно явно указать, какая последовательность относится к</w:t>
+        <w:t xml:space="preserve">A = ((N - 1) mod 4) + 1</w:t>
+      </w:r>
+    </w:p>
+    <w:p>
+      <w:pPr>
+        <w:pStyle w:val="FirstParagraph"/>
+      </w:pPr>
+      <w:r>
+        <w:t xml:space="preserve">Вариант</w:t>
       </w:r>
       <w:r>
         <w:t xml:space="preserve"> </w:t>
@@ -3130,71 +3384,373 @@
         <w:rPr>
           <w:rStyle w:val="VerbatimChar"/>
         </w:rPr>
-        <w:t xml:space="preserve">VLAN 10</w:t>
-      </w:r>
-      <w:r>
-        <w:t xml:space="preserve">, а какая — к</w:t>
-      </w:r>
-      <w:r>
-        <w:t xml:space="preserve"> </w:t>
-      </w:r>
-      <w:r>
-        <w:rPr>
-          <w:rStyle w:val="VerbatimChar"/>
-        </w:rPr>
-        <w:t xml:space="preserve">VLAN 20</w:t>
-      </w:r>
-      <w:r>
-        <w:t xml:space="preserve">;</w:t>
-      </w:r>
-    </w:p>
-    <w:p>
-      <w:pPr>
-        <w:pStyle w:val="Compact"/>
-        <w:numPr>
-          <w:ilvl w:val="0"/>
-          <w:numId w:val="1016"/>
-        </w:numPr>
-      </w:pPr>
-      <w:r>
-        <w:t xml:space="preserve">в приложениях к отчёту должен присутствовать файл</w:t>
-      </w:r>
-      <w:r>
-        <w:t xml:space="preserve"> </w:t>
-      </w:r>
-      <w:r>
-        <w:rPr>
-          <w:rStyle w:val="VerbatimChar"/>
-        </w:rPr>
-        <w:t xml:space="preserve">pcap/lr3_vlan_trunk_demo.pcapng</w:t>
-      </w:r>
-      <w:r>
-        <w:t xml:space="preserve">.</w:t>
-      </w:r>
-    </w:p>
-    <w:bookmarkEnd w:id="42"/>
-    <w:bookmarkEnd w:id="43"/>
-    <w:bookmarkStart w:id="48" w:name="chapter-iv"/>
-    <w:p>
-      <w:pPr>
-        <w:pStyle w:val="Heading2"/>
-      </w:pPr>
-      <w:r>
-        <w:t xml:space="preserve">Chapter IV</w:t>
-      </w:r>
-    </w:p>
-    <w:bookmarkStart w:id="44" w:name="Xbd118a2c8917c97c6573c06b583a6df6f00e826"/>
-    <w:p>
-      <w:pPr>
-        <w:pStyle w:val="Heading3"/>
-      </w:pPr>
-      <w:r>
-        <w:t xml:space="preserve">Задание 1. Изучение схемы и адресного плана</w:t>
-      </w:r>
-    </w:p>
-    <w:p>
-      <w:pPr>
-        <w:pStyle w:val="FirstParagraph"/>
+        <w:t xml:space="preserve">A</w:t>
+      </w:r>
+      <w:r>
+        <w:t xml:space="preserve">:</w:t>
+      </w:r>
+    </w:p>
+    <w:tbl>
+      <w:tblPr>
+        <w:tblStyle w:val="Table"/>
+        <w:tblW w:type="pct" w:w="5000"/>
+        <w:tblLayout w:type="fixed"/>
+        <w:tblLook w:firstRow="1" w:lastRow="0" w:firstColumn="0" w:lastColumn="0" w:noHBand="0" w:noVBand="0" w:val="0020"/>
+      </w:tblPr>
+      <w:tblGrid>
+        <w:gridCol w:w="1980"/>
+        <w:gridCol w:w="1980"/>
+        <w:gridCol w:w="1980"/>
+        <w:gridCol w:w="1980"/>
+      </w:tblGrid>
+      <w:tr>
+        <w:trPr>
+          <w:tblHeader w:val="on"/>
+        </w:trPr>
+        <w:tc>
+          <w:tcPr/>
+          <w:p>
+            <w:pPr>
+              <w:pStyle w:val="Compact"/>
+            </w:pPr>
+            <w:r>
+              <w:rPr>
+                <w:rStyle w:val="VerbatimChar"/>
+              </w:rPr>
+              <w:t xml:space="preserve">A</w:t>
+            </w:r>
+          </w:p>
+        </w:tc>
+        <w:tc>
+          <w:tcPr/>
+          <w:p>
+            <w:pPr>
+              <w:pStyle w:val="Compact"/>
+            </w:pPr>
+            <w:r>
+              <w:t xml:space="preserve">Основная VLAN</w:t>
+            </w:r>
+          </w:p>
+        </w:tc>
+        <w:tc>
+          <w:tcPr/>
+          <w:p>
+            <w:pPr>
+              <w:pStyle w:val="Compact"/>
+            </w:pPr>
+            <w:r>
+              <w:t xml:space="preserve">Базовая пара узлов</w:t>
+            </w:r>
+          </w:p>
+        </w:tc>
+        <w:tc>
+          <w:tcPr/>
+          <w:p>
+            <w:pPr>
+              <w:pStyle w:val="Compact"/>
+            </w:pPr>
+            <w:r>
+              <w:t xml:space="preserve">Первый акцент в отчёте</w:t>
+            </w:r>
+          </w:p>
+        </w:tc>
+      </w:tr>
+      <w:tr>
+        <w:tc>
+          <w:tcPr/>
+          <w:p>
+            <w:pPr>
+              <w:pStyle w:val="Compact"/>
+            </w:pPr>
+            <w:r>
+              <w:rPr>
+                <w:rStyle w:val="VerbatimChar"/>
+              </w:rPr>
+              <w:t xml:space="preserve">1</w:t>
+            </w:r>
+          </w:p>
+        </w:tc>
+        <w:tc>
+          <w:tcPr/>
+          <w:p>
+            <w:pPr>
+              <w:pStyle w:val="Compact"/>
+            </w:pPr>
+            <w:r>
+              <w:rPr>
+                <w:rStyle w:val="VerbatimChar"/>
+              </w:rPr>
+              <w:t xml:space="preserve">VLAN 10</w:t>
+            </w:r>
+          </w:p>
+        </w:tc>
+        <w:tc>
+          <w:tcPr/>
+          <w:p>
+            <w:pPr>
+              <w:pStyle w:val="Compact"/>
+            </w:pPr>
+            <w:r>
+              <w:rPr>
+                <w:rStyle w:val="VerbatimChar"/>
+              </w:rPr>
+              <w:t xml:space="preserve">PC1 → PC3</w:t>
+            </w:r>
+          </w:p>
+        </w:tc>
+        <w:tc>
+          <w:tcPr/>
+          <w:p>
+            <w:pPr>
+              <w:pStyle w:val="Compact"/>
+            </w:pPr>
+            <w:r>
+              <w:rPr>
+                <w:rStyle w:val="VerbatimChar"/>
+              </w:rPr>
+              <w:t xml:space="preserve">ARP Request</w:t>
+            </w:r>
+            <w:r>
+              <w:t xml:space="preserve"> </w:t>
+            </w:r>
+            <w:r>
+              <w:t xml:space="preserve">и</w:t>
+            </w:r>
+            <w:r>
+              <w:t xml:space="preserve"> </w:t>
+            </w:r>
+            <w:r>
+              <w:rPr>
+                <w:rStyle w:val="VerbatimChar"/>
+              </w:rPr>
+              <w:t xml:space="preserve">ARP Reply</w:t>
+            </w:r>
+          </w:p>
+        </w:tc>
+      </w:tr>
+      <w:tr>
+        <w:tc>
+          <w:tcPr/>
+          <w:p>
+            <w:pPr>
+              <w:pStyle w:val="Compact"/>
+            </w:pPr>
+            <w:r>
+              <w:rPr>
+                <w:rStyle w:val="VerbatimChar"/>
+              </w:rPr>
+              <w:t xml:space="preserve">2</w:t>
+            </w:r>
+          </w:p>
+        </w:tc>
+        <w:tc>
+          <w:tcPr/>
+          <w:p>
+            <w:pPr>
+              <w:pStyle w:val="Compact"/>
+            </w:pPr>
+            <w:r>
+              <w:rPr>
+                <w:rStyle w:val="VerbatimChar"/>
+              </w:rPr>
+              <w:t xml:space="preserve">VLAN 10</w:t>
+            </w:r>
+          </w:p>
+        </w:tc>
+        <w:tc>
+          <w:tcPr/>
+          <w:p>
+            <w:pPr>
+              <w:pStyle w:val="Compact"/>
+            </w:pPr>
+            <w:r>
+              <w:rPr>
+                <w:rStyle w:val="VerbatimChar"/>
+              </w:rPr>
+              <w:t xml:space="preserve">PC1 → PC3</w:t>
+            </w:r>
+          </w:p>
+        </w:tc>
+        <w:tc>
+          <w:tcPr/>
+          <w:p>
+            <w:pPr>
+              <w:pStyle w:val="Compact"/>
+            </w:pPr>
+            <w:r>
+              <w:rPr>
+                <w:rStyle w:val="VerbatimChar"/>
+              </w:rPr>
+              <w:t xml:space="preserve">ICMP Echo Request</w:t>
+            </w:r>
+            <w:r>
+              <w:t xml:space="preserve"> </w:t>
+            </w:r>
+            <w:r>
+              <w:t xml:space="preserve">и</w:t>
+            </w:r>
+            <w:r>
+              <w:t xml:space="preserve"> </w:t>
+            </w:r>
+            <w:r>
+              <w:rPr>
+                <w:rStyle w:val="VerbatimChar"/>
+              </w:rPr>
+              <w:t xml:space="preserve">ICMP Echo Reply</w:t>
+            </w:r>
+          </w:p>
+        </w:tc>
+      </w:tr>
+      <w:tr>
+        <w:tc>
+          <w:tcPr/>
+          <w:p>
+            <w:pPr>
+              <w:pStyle w:val="Compact"/>
+            </w:pPr>
+            <w:r>
+              <w:rPr>
+                <w:rStyle w:val="VerbatimChar"/>
+              </w:rPr>
+              <w:t xml:space="preserve">3</w:t>
+            </w:r>
+          </w:p>
+        </w:tc>
+        <w:tc>
+          <w:tcPr/>
+          <w:p>
+            <w:pPr>
+              <w:pStyle w:val="Compact"/>
+            </w:pPr>
+            <w:r>
+              <w:rPr>
+                <w:rStyle w:val="VerbatimChar"/>
+              </w:rPr>
+              <w:t xml:space="preserve">VLAN 20</w:t>
+            </w:r>
+          </w:p>
+        </w:tc>
+        <w:tc>
+          <w:tcPr/>
+          <w:p>
+            <w:pPr>
+              <w:pStyle w:val="Compact"/>
+            </w:pPr>
+            <w:r>
+              <w:rPr>
+                <w:rStyle w:val="VerbatimChar"/>
+              </w:rPr>
+              <w:t xml:space="preserve">PC2 → PC4</w:t>
+            </w:r>
+          </w:p>
+        </w:tc>
+        <w:tc>
+          <w:tcPr/>
+          <w:p>
+            <w:pPr>
+              <w:pStyle w:val="Compact"/>
+            </w:pPr>
+            <w:r>
+              <w:rPr>
+                <w:rStyle w:val="VerbatimChar"/>
+              </w:rPr>
+              <w:t xml:space="preserve">ARP Request</w:t>
+            </w:r>
+            <w:r>
+              <w:t xml:space="preserve"> </w:t>
+            </w:r>
+            <w:r>
+              <w:t xml:space="preserve">и</w:t>
+            </w:r>
+            <w:r>
+              <w:t xml:space="preserve"> </w:t>
+            </w:r>
+            <w:r>
+              <w:rPr>
+                <w:rStyle w:val="VerbatimChar"/>
+              </w:rPr>
+              <w:t xml:space="preserve">ARP Reply</w:t>
+            </w:r>
+          </w:p>
+        </w:tc>
+      </w:tr>
+      <w:tr>
+        <w:tc>
+          <w:tcPr/>
+          <w:p>
+            <w:pPr>
+              <w:pStyle w:val="Compact"/>
+            </w:pPr>
+            <w:r>
+              <w:rPr>
+                <w:rStyle w:val="VerbatimChar"/>
+              </w:rPr>
+              <w:t xml:space="preserve">4</w:t>
+            </w:r>
+          </w:p>
+        </w:tc>
+        <w:tc>
+          <w:tcPr/>
+          <w:p>
+            <w:pPr>
+              <w:pStyle w:val="Compact"/>
+            </w:pPr>
+            <w:r>
+              <w:rPr>
+                <w:rStyle w:val="VerbatimChar"/>
+              </w:rPr>
+              <w:t xml:space="preserve">VLAN 20</w:t>
+            </w:r>
+          </w:p>
+        </w:tc>
+        <w:tc>
+          <w:tcPr/>
+          <w:p>
+            <w:pPr>
+              <w:pStyle w:val="Compact"/>
+            </w:pPr>
+            <w:r>
+              <w:rPr>
+                <w:rStyle w:val="VerbatimChar"/>
+              </w:rPr>
+              <w:t xml:space="preserve">PC2 → PC4</w:t>
+            </w:r>
+          </w:p>
+        </w:tc>
+        <w:tc>
+          <w:tcPr/>
+          <w:p>
+            <w:pPr>
+              <w:pStyle w:val="Compact"/>
+            </w:pPr>
+            <w:r>
+              <w:rPr>
+                <w:rStyle w:val="VerbatimChar"/>
+              </w:rPr>
+              <w:t xml:space="preserve">ICMP Echo Request</w:t>
+            </w:r>
+            <w:r>
+              <w:t xml:space="preserve"> </w:t>
+            </w:r>
+            <w:r>
+              <w:t xml:space="preserve">и</w:t>
+            </w:r>
+            <w:r>
+              <w:t xml:space="preserve"> </w:t>
+            </w:r>
+            <w:r>
+              <w:rPr>
+                <w:rStyle w:val="VerbatimChar"/>
+              </w:rPr>
+              <w:t xml:space="preserve">ICMP Echo Reply</w:t>
+            </w:r>
+          </w:p>
+        </w:tc>
+      </w:tr>
+    </w:tbl>
+    <w:p>
+      <w:pPr>
+        <w:pStyle w:val="BodyText"/>
       </w:pPr>
       <w:r>
         <w:t xml:space="preserve">Изучи опорную схему стенда и таблицу адресации из методических указаний.</w:t>
@@ -3277,7 +3833,34 @@
         </w:numPr>
       </w:pPr>
       <w:r>
-        <w:t xml:space="preserve">на каком именно линке выполнен захват.</w:t>
+        <w:t xml:space="preserve">на каком именно линке выполнен захват;</w:t>
+      </w:r>
+    </w:p>
+    <w:p>
+      <w:pPr>
+        <w:pStyle w:val="Compact"/>
+        <w:numPr>
+          <w:ilvl w:val="0"/>
+          <w:numId w:val="1017"/>
+        </w:numPr>
+      </w:pPr>
+      <w:r>
+        <w:t xml:space="preserve">значение параметра</w:t>
+      </w:r>
+      <w:r>
+        <w:t xml:space="preserve"> </w:t>
+      </w:r>
+      <w:r>
+        <w:rPr>
+          <w:rStyle w:val="VerbatimChar"/>
+        </w:rPr>
+        <w:t xml:space="preserve">A</w:t>
+      </w:r>
+      <w:r>
+        <w:t xml:space="preserve"> </w:t>
+      </w:r>
+      <w:r>
+        <w:t xml:space="preserve">и какая последовательность становится основной для дальнейшего разбора.</w:t>
       </w:r>
     </w:p>
     <w:p>
@@ -3333,25 +3916,19 @@
         <w:t xml:space="preserve">узел → VLAN</w:t>
       </w:r>
       <w:r>
-        <w:t xml:space="preserve">.</w:t>
-      </w:r>
-    </w:p>
-    <w:bookmarkEnd w:id="44"/>
-    <w:bookmarkStart w:id="45" w:name="задание-2-анализ-трафика-vlan-10"/>
-    <w:p>
-      <w:pPr>
-        <w:pStyle w:val="Heading3"/>
-      </w:pPr>
-      <w:r>
-        <w:t xml:space="preserve">Задание 2. Анализ трафика VLAN 10</w:t>
-      </w:r>
-    </w:p>
-    <w:p>
-      <w:pPr>
-        <w:pStyle w:val="FirstParagraph"/>
-      </w:pPr>
-      <w:r>
-        <w:t xml:space="preserve">Открой файл</w:t>
+        <w:t xml:space="preserve">;</w:t>
+      </w:r>
+    </w:p>
+    <w:p>
+      <w:pPr>
+        <w:pStyle w:val="Compact"/>
+        <w:numPr>
+          <w:ilvl w:val="0"/>
+          <w:numId w:val="1018"/>
+        </w:numPr>
+      </w:pPr>
+      <w:r>
+        <w:t xml:space="preserve">краткую фиксацию значения параметра</w:t>
       </w:r>
       <w:r>
         <w:t xml:space="preserve"> </w:t>
@@ -3360,13 +3937,28 @@
         <w:rPr>
           <w:rStyle w:val="VerbatimChar"/>
         </w:rPr>
-        <w:t xml:space="preserve">pcap/lr3_vlan_trunk_demo.pcapng</w:t>
-      </w:r>
-      <w:r>
-        <w:t xml:space="preserve"> </w:t>
-      </w:r>
-      <w:r>
-        <w:t xml:space="preserve">в Wireshark и отфильтруй кадры</w:t>
+        <w:t xml:space="preserve">A</w:t>
+      </w:r>
+      <w:r>
+        <w:t xml:space="preserve">.</w:t>
+      </w:r>
+    </w:p>
+    <w:bookmarkEnd w:id="44"/>
+    <w:bookmarkStart w:id="45" w:name="X3bbbf988f8fe36944d39d8634602395d2b92c39"/>
+    <w:p>
+      <w:pPr>
+        <w:pStyle w:val="Heading3"/>
+      </w:pPr>
+      <w:r>
+        <w:t xml:space="preserve">Задание 2. Детальный анализ последовательности по варианту</w:t>
+      </w:r>
+    </w:p>
+    <w:p>
+      <w:pPr>
+        <w:pStyle w:val="FirstParagraph"/>
+      </w:pPr>
+      <w:r>
+        <w:t xml:space="preserve">Для этого задания используется параметр</w:t>
       </w:r>
       <w:r>
         <w:t xml:space="preserve"> </w:t>
@@ -3375,18 +3967,10 @@
         <w:rPr>
           <w:rStyle w:val="VerbatimChar"/>
         </w:rPr>
-        <w:t xml:space="preserve">VLAN 10</w:t>
-      </w:r>
-      <w:r>
-        <w:t xml:space="preserve">.</w:t>
-      </w:r>
-    </w:p>
-    <w:p>
-      <w:pPr>
-        <w:pStyle w:val="BodyText"/>
-      </w:pPr>
-      <w:r>
-        <w:t xml:space="preserve">Порядок выполнения:</w:t>
+        <w:t xml:space="preserve">B</w:t>
+      </w:r>
+      <w:r>
+        <w:t xml:space="preserve">, который вычисляется по формуле:</w:t>
       </w:r>
     </w:p>
     <w:p>
@@ -3398,7 +3982,314 @@
         </w:numPr>
       </w:pPr>
       <w:r>
-        <w:t xml:space="preserve">применить фильтр</w:t>
+        <w:rPr>
+          <w:rStyle w:val="VerbatimChar"/>
+        </w:rPr>
+        <w:t xml:space="preserve">B = ((N - 1) mod 3) + 1</w:t>
+      </w:r>
+    </w:p>
+    <w:p>
+      <w:pPr>
+        <w:pStyle w:val="FirstParagraph"/>
+      </w:pPr>
+      <w:r>
+        <w:t xml:space="preserve">Вариант</w:t>
+      </w:r>
+      <w:r>
+        <w:t xml:space="preserve"> </w:t>
+      </w:r>
+      <w:r>
+        <w:rPr>
+          <w:rStyle w:val="VerbatimChar"/>
+        </w:rPr>
+        <w:t xml:space="preserve">B</w:t>
+      </w:r>
+      <w:r>
+        <w:t xml:space="preserve">:</w:t>
+      </w:r>
+    </w:p>
+    <w:tbl>
+      <w:tblPr>
+        <w:tblStyle w:val="Table"/>
+        <w:tblW w:type="pct" w:w="5000"/>
+        <w:tblLayout w:type="fixed"/>
+        <w:tblLook w:firstRow="1" w:lastRow="0" w:firstColumn="0" w:lastColumn="0" w:noHBand="0" w:noVBand="0" w:val="0020"/>
+      </w:tblPr>
+      <w:tblGrid>
+        <w:gridCol w:w="3960"/>
+        <w:gridCol w:w="3960"/>
+      </w:tblGrid>
+      <w:tr>
+        <w:trPr>
+          <w:tblHeader w:val="on"/>
+        </w:trPr>
+        <w:tc>
+          <w:tcPr/>
+          <w:p>
+            <w:pPr>
+              <w:pStyle w:val="Compact"/>
+            </w:pPr>
+            <w:r>
+              <w:rPr>
+                <w:rStyle w:val="VerbatimChar"/>
+              </w:rPr>
+              <w:t xml:space="preserve">B</w:t>
+            </w:r>
+          </w:p>
+        </w:tc>
+        <w:tc>
+          <w:tcPr/>
+          <w:p>
+            <w:pPr>
+              <w:pStyle w:val="Compact"/>
+            </w:pPr>
+            <w:r>
+              <w:t xml:space="preserve">Дополнительный аналитический акцент</w:t>
+            </w:r>
+          </w:p>
+        </w:tc>
+      </w:tr>
+      <w:tr>
+        <w:tc>
+          <w:tcPr/>
+          <w:p>
+            <w:pPr>
+              <w:pStyle w:val="Compact"/>
+            </w:pPr>
+            <w:r>
+              <w:rPr>
+                <w:rStyle w:val="VerbatimChar"/>
+              </w:rPr>
+              <w:t xml:space="preserve">1</w:t>
+            </w:r>
+          </w:p>
+        </w:tc>
+        <w:tc>
+          <w:tcPr/>
+          <w:p>
+            <w:pPr>
+              <w:pStyle w:val="Compact"/>
+            </w:pPr>
+            <w:r>
+              <w:t xml:space="preserve">объяснить переход от широковещательного</w:t>
+            </w:r>
+            <w:r>
+              <w:t xml:space="preserve"> </w:t>
+            </w:r>
+            <w:r>
+              <w:rPr>
+                <w:rStyle w:val="VerbatimChar"/>
+              </w:rPr>
+              <w:t xml:space="preserve">ARP Request</w:t>
+            </w:r>
+            <w:r>
+              <w:t xml:space="preserve"> </w:t>
+            </w:r>
+            <w:r>
+              <w:t xml:space="preserve">к одноадресным кадрам ответа и</w:t>
+            </w:r>
+            <w:r>
+              <w:t xml:space="preserve"> </w:t>
+            </w:r>
+            <w:r>
+              <w:rPr>
+                <w:rStyle w:val="VerbatimChar"/>
+              </w:rPr>
+              <w:t xml:space="preserve">ICMP</w:t>
+            </w:r>
+          </w:p>
+        </w:tc>
+      </w:tr>
+      <w:tr>
+        <w:tc>
+          <w:tcPr/>
+          <w:p>
+            <w:pPr>
+              <w:pStyle w:val="Compact"/>
+            </w:pPr>
+            <w:r>
+              <w:rPr>
+                <w:rStyle w:val="VerbatimChar"/>
+              </w:rPr>
+              <w:t xml:space="preserve">2</w:t>
+            </w:r>
+          </w:p>
+        </w:tc>
+        <w:tc>
+          <w:tcPr/>
+          <w:p>
+            <w:pPr>
+              <w:pStyle w:val="Compact"/>
+            </w:pPr>
+            <w:r>
+              <w:t xml:space="preserve">подробно показать место тега</w:t>
+            </w:r>
+            <w:r>
+              <w:t xml:space="preserve"> </w:t>
+            </w:r>
+            <w:r>
+              <w:rPr>
+                <w:rStyle w:val="VerbatimChar"/>
+              </w:rPr>
+              <w:t xml:space="preserve">802.1Q</w:t>
+            </w:r>
+            <w:r>
+              <w:t xml:space="preserve"> </w:t>
+            </w:r>
+            <w:r>
+              <w:t xml:space="preserve">и пояснить роль полей</w:t>
+            </w:r>
+            <w:r>
+              <w:t xml:space="preserve"> </w:t>
+            </w:r>
+            <w:r>
+              <w:rPr>
+                <w:rStyle w:val="VerbatimChar"/>
+              </w:rPr>
+              <w:t xml:space="preserve">TPID</w:t>
+            </w:r>
+            <w:r>
+              <w:t xml:space="preserve"> </w:t>
+            </w:r>
+            <w:r>
+              <w:t xml:space="preserve">и</w:t>
+            </w:r>
+            <w:r>
+              <w:t xml:space="preserve"> </w:t>
+            </w:r>
+            <w:r>
+              <w:rPr>
+                <w:rStyle w:val="VerbatimChar"/>
+              </w:rPr>
+              <w:t xml:space="preserve">VLAN ID</w:t>
+            </w:r>
+          </w:p>
+        </w:tc>
+      </w:tr>
+      <w:tr>
+        <w:tc>
+          <w:tcPr/>
+          <w:p>
+            <w:pPr>
+              <w:pStyle w:val="Compact"/>
+            </w:pPr>
+            <w:r>
+              <w:rPr>
+                <w:rStyle w:val="VerbatimChar"/>
+              </w:rPr>
+              <w:t xml:space="preserve">3</w:t>
+            </w:r>
+          </w:p>
+        </w:tc>
+        <w:tc>
+          <w:tcPr/>
+          <w:p>
+            <w:pPr>
+              <w:pStyle w:val="Compact"/>
+            </w:pPr>
+            <w:r>
+              <w:t xml:space="preserve">пояснить, какие кадры можно связать с flooding, а какие — с адресной пересылкой после обучения по MAC</w:t>
+            </w:r>
+          </w:p>
+        </w:tc>
+      </w:tr>
+    </w:tbl>
+    <w:p>
+      <w:pPr>
+        <w:pStyle w:val="BodyText"/>
+      </w:pPr>
+      <w:r>
+        <w:t xml:space="preserve">Открой файл</w:t>
+      </w:r>
+      <w:r>
+        <w:t xml:space="preserve"> </w:t>
+      </w:r>
+      <w:r>
+        <w:rPr>
+          <w:rStyle w:val="VerbatimChar"/>
+        </w:rPr>
+        <w:t xml:space="preserve">pcap/lr3_vlan_trunk_demo.pcapng</w:t>
+      </w:r>
+      <w:r>
+        <w:t xml:space="preserve"> </w:t>
+      </w:r>
+      <w:r>
+        <w:t xml:space="preserve">в Wireshark и выполни детальный анализ</w:t>
+      </w:r>
+      <w:r>
+        <w:t xml:space="preserve"> </w:t>
+      </w:r>
+      <w:r>
+        <w:rPr>
+          <w:b/>
+          <w:bCs/>
+        </w:rPr>
+        <w:t xml:space="preserve">основной</w:t>
+      </w:r>
+      <w:r>
+        <w:t xml:space="preserve"> </w:t>
+      </w:r>
+      <w:r>
+        <w:t xml:space="preserve">последовательности, определённой параметром</w:t>
+      </w:r>
+      <w:r>
+        <w:t xml:space="preserve"> </w:t>
+      </w:r>
+      <w:r>
+        <w:rPr>
+          <w:rStyle w:val="VerbatimChar"/>
+        </w:rPr>
+        <w:t xml:space="preserve">A</w:t>
+      </w:r>
+      <w:r>
+        <w:t xml:space="preserve">.</w:t>
+      </w:r>
+    </w:p>
+    <w:p>
+      <w:pPr>
+        <w:pStyle w:val="BodyText"/>
+      </w:pPr>
+      <w:r>
+        <w:t xml:space="preserve">Порядок выполнения:</w:t>
+      </w:r>
+    </w:p>
+    <w:p>
+      <w:pPr>
+        <w:pStyle w:val="Compact"/>
+        <w:numPr>
+          <w:ilvl w:val="0"/>
+          <w:numId w:val="1020"/>
+        </w:numPr>
+      </w:pPr>
+      <w:r>
+        <w:t xml:space="preserve">если по параметру</w:t>
+      </w:r>
+      <w:r>
+        <w:t xml:space="preserve"> </w:t>
+      </w:r>
+      <w:r>
+        <w:rPr>
+          <w:rStyle w:val="VerbatimChar"/>
+        </w:rPr>
+        <w:t xml:space="preserve">A</w:t>
+      </w:r>
+      <w:r>
+        <w:t xml:space="preserve"> </w:t>
+      </w:r>
+      <w:r>
+        <w:t xml:space="preserve">основной является</w:t>
+      </w:r>
+      <w:r>
+        <w:t xml:space="preserve"> </w:t>
+      </w:r>
+      <w:r>
+        <w:rPr>
+          <w:rStyle w:val="VerbatimChar"/>
+        </w:rPr>
+        <w:t xml:space="preserve">VLAN 10</w:t>
+      </w:r>
+      <w:r>
+        <w:t xml:space="preserve">, применить фильтр</w:t>
       </w:r>
       <w:r>
         <w:t xml:space="preserve"> </w:t>
@@ -3410,6 +4301,30 @@
         <w:t xml:space="preserve">vlan.id == 10</w:t>
       </w:r>
       <w:r>
+        <w:t xml:space="preserve">; если основной является</w:t>
+      </w:r>
+      <w:r>
+        <w:t xml:space="preserve"> </w:t>
+      </w:r>
+      <w:r>
+        <w:rPr>
+          <w:rStyle w:val="VerbatimChar"/>
+        </w:rPr>
+        <w:t xml:space="preserve">VLAN 20</w:t>
+      </w:r>
+      <w:r>
+        <w:t xml:space="preserve">, применить фильтр</w:t>
+      </w:r>
+      <w:r>
+        <w:t xml:space="preserve"> </w:t>
+      </w:r>
+      <w:r>
+        <w:rPr>
+          <w:rStyle w:val="VerbatimChar"/>
+        </w:rPr>
+        <w:t xml:space="preserve">vlan.id == 20</w:t>
+      </w:r>
+      <w:r>
         <w:t xml:space="preserve">;</w:t>
       </w:r>
     </w:p>
@@ -3418,7 +4333,7 @@
         <w:pStyle w:val="Compact"/>
         <w:numPr>
           <w:ilvl w:val="0"/>
-          <w:numId w:val="1019"/>
+          <w:numId w:val="1020"/>
         </w:numPr>
       </w:pPr>
       <w:r>
@@ -3442,7 +4357,7 @@
         <w:pStyle w:val="Compact"/>
         <w:numPr>
           <w:ilvl w:val="0"/>
-          <w:numId w:val="1019"/>
+          <w:numId w:val="1020"/>
         </w:numPr>
       </w:pPr>
       <w:r>
@@ -3466,7 +4381,7 @@
         <w:pStyle w:val="Compact"/>
         <w:numPr>
           <w:ilvl w:val="0"/>
-          <w:numId w:val="1019"/>
+          <w:numId w:val="1020"/>
         </w:numPr>
       </w:pPr>
       <w:r>
@@ -3490,7 +4405,7 @@
         <w:pStyle w:val="Compact"/>
         <w:numPr>
           <w:ilvl w:val="0"/>
-          <w:numId w:val="1019"/>
+          <w:numId w:val="1020"/>
         </w:numPr>
       </w:pPr>
       <w:r>
@@ -3514,7 +4429,7 @@
         <w:pStyle w:val="Compact"/>
         <w:numPr>
           <w:ilvl w:val="0"/>
-          <w:numId w:val="1019"/>
+          <w:numId w:val="1020"/>
         </w:numPr>
       </w:pPr>
       <w:r>
@@ -3526,7 +4441,7 @@
         <w:pStyle w:val="Compact"/>
         <w:numPr>
           <w:ilvl w:val="1"/>
-          <w:numId w:val="1020"/>
+          <w:numId w:val="1021"/>
         </w:numPr>
       </w:pPr>
       <w:r>
@@ -3538,7 +4453,7 @@
         <w:pStyle w:val="Compact"/>
         <w:numPr>
           <w:ilvl w:val="1"/>
-          <w:numId w:val="1020"/>
+          <w:numId w:val="1021"/>
         </w:numPr>
       </w:pPr>
       <w:r>
@@ -3556,7 +4471,7 @@
         <w:pStyle w:val="Compact"/>
         <w:numPr>
           <w:ilvl w:val="1"/>
-          <w:numId w:val="1020"/>
+          <w:numId w:val="1021"/>
         </w:numPr>
       </w:pPr>
       <w:r>
@@ -3574,7 +4489,7 @@
         <w:pStyle w:val="Compact"/>
         <w:numPr>
           <w:ilvl w:val="1"/>
-          <w:numId w:val="1020"/>
+          <w:numId w:val="1021"/>
         </w:numPr>
       </w:pPr>
       <w:r>
@@ -3592,7 +4507,7 @@
         <w:pStyle w:val="Compact"/>
         <w:numPr>
           <w:ilvl w:val="1"/>
-          <w:numId w:val="1020"/>
+          <w:numId w:val="1021"/>
         </w:numPr>
       </w:pPr>
       <w:r>
@@ -3610,7 +4525,7 @@
         <w:pStyle w:val="Compact"/>
         <w:numPr>
           <w:ilvl w:val="1"/>
-          <w:numId w:val="1020"/>
+          <w:numId w:val="1021"/>
         </w:numPr>
       </w:pPr>
       <w:r>
@@ -3628,7 +4543,7 @@
         <w:pStyle w:val="Compact"/>
         <w:numPr>
           <w:ilvl w:val="1"/>
-          <w:numId w:val="1020"/>
+          <w:numId w:val="1021"/>
         </w:numPr>
       </w:pPr>
       <w:r>
@@ -3646,19 +4561,11 @@
         <w:pStyle w:val="Compact"/>
         <w:numPr>
           <w:ilvl w:val="1"/>
-          <w:numId w:val="1020"/>
+          <w:numId w:val="1021"/>
         </w:numPr>
       </w:pPr>
       <w:r>
-        <w:t xml:space="preserve">протокол верхнего уровня.</w:t>
-      </w:r>
-    </w:p>
-    <w:p>
-      <w:pPr>
-        <w:pStyle w:val="FirstParagraph"/>
-      </w:pPr>
-      <w:r>
-        <w:t xml:space="preserve">После этого необходимо письменно объяснить:</w:t>
+        <w:t xml:space="preserve">протокол верхнего уровня;</w:t>
       </w:r>
     </w:p>
     <w:p>
@@ -3666,11 +4573,11 @@
         <w:pStyle w:val="Compact"/>
         <w:numPr>
           <w:ilvl w:val="0"/>
-          <w:numId w:val="1021"/>
+          <w:numId w:val="1020"/>
         </w:numPr>
       </w:pPr>
       <w:r>
-        <w:t xml:space="preserve">почему</w:t>
+        <w:t xml:space="preserve">отдельно дать письменный комментарий по варианту</w:t>
       </w:r>
       <w:r>
         <w:t xml:space="preserve"> </w:t>
@@ -3679,59 +4586,10 @@
         <w:rPr>
           <w:rStyle w:val="VerbatimChar"/>
         </w:rPr>
-        <w:t xml:space="preserve">ARP Request</w:t>
-      </w:r>
-      <w:r>
-        <w:t xml:space="preserve"> </w:t>
-      </w:r>
-      <w:r>
-        <w:t xml:space="preserve">передаётся как широковещательный кадр;</w:t>
-      </w:r>
-    </w:p>
-    <w:p>
-      <w:pPr>
-        <w:pStyle w:val="Compact"/>
-        <w:numPr>
-          <w:ilvl w:val="0"/>
-          <w:numId w:val="1021"/>
-        </w:numPr>
-      </w:pPr>
-      <w:r>
-        <w:t xml:space="preserve">почему в trunk-захвате этот кадр всё равно содержит</w:t>
-      </w:r>
-      <w:r>
-        <w:t xml:space="preserve"> </w:t>
-      </w:r>
-      <w:r>
-        <w:rPr>
-          <w:rStyle w:val="VerbatimChar"/>
-        </w:rPr>
-        <w:t xml:space="preserve">VLAN ID</w:t>
-      </w:r>
-      <w:r>
-        <w:t xml:space="preserve">;</w:t>
-      </w:r>
-    </w:p>
-    <w:p>
-      <w:pPr>
-        <w:pStyle w:val="Compact"/>
-        <w:numPr>
-          <w:ilvl w:val="0"/>
-          <w:numId w:val="1021"/>
-        </w:numPr>
-      </w:pPr>
-      <w:r>
-        <w:t xml:space="preserve">что именно доказывает наличие тега 802.1Q в кадре.</w:t>
-      </w:r>
-    </w:p>
-    <w:bookmarkEnd w:id="45"/>
-    <w:bookmarkStart w:id="46" w:name="задание-3-анализ-трафика-vlan-20"/>
-    <w:p>
-      <w:pPr>
-        <w:pStyle w:val="Heading3"/>
-      </w:pPr>
-      <w:r>
-        <w:t xml:space="preserve">Задание 3. Анализ трафика VLAN 20</w:t>
+        <w:t xml:space="preserve">B</w:t>
+      </w:r>
+      <w:r>
+        <w:t xml:space="preserve">.</w:t>
       </w:r>
     </w:p>
     <w:p>
@@ -3739,15 +4597,7 @@
         <w:pStyle w:val="FirstParagraph"/>
       </w:pPr>
       <w:r>
-        <w:t xml:space="preserve">Повтори анализ для второй VLAN.</w:t>
-      </w:r>
-    </w:p>
-    <w:p>
-      <w:pPr>
-        <w:pStyle w:val="BodyText"/>
-      </w:pPr>
-      <w:r>
-        <w:t xml:space="preserve">Порядок выполнения:</w:t>
+        <w:t xml:space="preserve">В отчёт по данному заданию включить:</w:t>
       </w:r>
     </w:p>
     <w:p>
@@ -3759,19 +4609,7 @@
         </w:numPr>
       </w:pPr>
       <w:r>
-        <w:t xml:space="preserve">применить фильтр</w:t>
-      </w:r>
-      <w:r>
-        <w:t xml:space="preserve"> </w:t>
-      </w:r>
-      <w:r>
-        <w:rPr>
-          <w:rStyle w:val="VerbatimChar"/>
-        </w:rPr>
-        <w:t xml:space="preserve">vlan.id == 20</w:t>
-      </w:r>
-      <w:r>
-        <w:t xml:space="preserve">;</w:t>
+        <w:t xml:space="preserve">не менее 4 скриншотов Wireshark для основной последовательности;</w:t>
       </w:r>
     </w:p>
     <w:p>
@@ -3783,19 +4621,7 @@
         </w:numPr>
       </w:pPr>
       <w:r>
-        <w:t xml:space="preserve">найти</w:t>
-      </w:r>
-      <w:r>
-        <w:t xml:space="preserve"> </w:t>
-      </w:r>
-      <w:r>
-        <w:rPr>
-          <w:rStyle w:val="VerbatimChar"/>
-        </w:rPr>
-        <w:t xml:space="preserve">ARP Request</w:t>
-      </w:r>
-      <w:r>
-        <w:t xml:space="preserve">;</w:t>
+        <w:t xml:space="preserve">подробную таблицу анализа четырёх кадров;</w:t>
       </w:r>
     </w:p>
     <w:p>
@@ -3807,7 +4633,7 @@
         </w:numPr>
       </w:pPr>
       <w:r>
-        <w:t xml:space="preserve">найти</w:t>
+        <w:t xml:space="preserve">отдельный комментарий по варианту</w:t>
       </w:r>
       <w:r>
         <w:t xml:space="preserve"> </w:t>
@@ -3816,22 +4642,28 @@
         <w:rPr>
           <w:rStyle w:val="VerbatimChar"/>
         </w:rPr>
-        <w:t xml:space="preserve">ARP Reply</w:t>
-      </w:r>
-      <w:r>
-        <w:t xml:space="preserve">;</w:t>
-      </w:r>
-    </w:p>
-    <w:p>
-      <w:pPr>
-        <w:pStyle w:val="Compact"/>
-        <w:numPr>
-          <w:ilvl w:val="0"/>
-          <w:numId w:val="1022"/>
-        </w:numPr>
-      </w:pPr>
-      <w:r>
-        <w:t xml:space="preserve">найти</w:t>
+        <w:t xml:space="preserve">B</w:t>
+      </w:r>
+      <w:r>
+        <w:t xml:space="preserve">.</w:t>
+      </w:r>
+    </w:p>
+    <w:bookmarkEnd w:id="45"/>
+    <w:bookmarkStart w:id="46" w:name="Xe34fe7dfef7e69b276ec32bfd701081a7f544d2"/>
+    <w:p>
+      <w:pPr>
+        <w:pStyle w:val="Heading3"/>
+      </w:pPr>
+      <w:r>
+        <w:t xml:space="preserve">Задание 3. Анализ второй VLAN и сравнительный разбор</w:t>
+      </w:r>
+    </w:p>
+    <w:p>
+      <w:pPr>
+        <w:pStyle w:val="FirstParagraph"/>
+      </w:pPr>
+      <w:r>
+        <w:t xml:space="preserve">Для этого задания используется параметр</w:t>
       </w:r>
       <w:r>
         <w:t xml:space="preserve"> </w:t>
@@ -3840,66 +4672,10 @@
         <w:rPr>
           <w:rStyle w:val="VerbatimChar"/>
         </w:rPr>
-        <w:t xml:space="preserve">ICMP Echo Request</w:t>
-      </w:r>
-      <w:r>
-        <w:t xml:space="preserve">;</w:t>
-      </w:r>
-    </w:p>
-    <w:p>
-      <w:pPr>
-        <w:pStyle w:val="Compact"/>
-        <w:numPr>
-          <w:ilvl w:val="0"/>
-          <w:numId w:val="1022"/>
-        </w:numPr>
-      </w:pPr>
-      <w:r>
-        <w:t xml:space="preserve">найти</w:t>
-      </w:r>
-      <w:r>
-        <w:t xml:space="preserve"> </w:t>
-      </w:r>
-      <w:r>
-        <w:rPr>
-          <w:rStyle w:val="VerbatimChar"/>
-        </w:rPr>
-        <w:t xml:space="preserve">ICMP Echo Reply</w:t>
-      </w:r>
-      <w:r>
-        <w:t xml:space="preserve">;</w:t>
-      </w:r>
-    </w:p>
-    <w:p>
-      <w:pPr>
-        <w:pStyle w:val="Compact"/>
-        <w:numPr>
-          <w:ilvl w:val="0"/>
-          <w:numId w:val="1022"/>
-        </w:numPr>
-      </w:pPr>
-      <w:r>
-        <w:t xml:space="preserve">выписать те же поля, что и для</w:t>
-      </w:r>
-      <w:r>
-        <w:t xml:space="preserve"> </w:t>
-      </w:r>
-      <w:r>
-        <w:rPr>
-          <w:rStyle w:val="VerbatimChar"/>
-        </w:rPr>
-        <w:t xml:space="preserve">VLAN 10</w:t>
-      </w:r>
-      <w:r>
-        <w:t xml:space="preserve">.</w:t>
-      </w:r>
-    </w:p>
-    <w:p>
-      <w:pPr>
-        <w:pStyle w:val="FirstParagraph"/>
-      </w:pPr>
-      <w:r>
-        <w:t xml:space="preserve">После этого необходимо письменно ответить:</w:t>
+        <w:t xml:space="preserve">C</w:t>
+      </w:r>
+      <w:r>
+        <w:t xml:space="preserve">, который вычисляется по формуле:</w:t>
       </w:r>
     </w:p>
     <w:p>
@@ -3911,22 +4687,18 @@
         </w:numPr>
       </w:pPr>
       <w:r>
-        <w:t xml:space="preserve">чем последовательность в</w:t>
-      </w:r>
-      <w:r>
-        <w:t xml:space="preserve"> </w:t>
-      </w:r>
-      <w:r>
         <w:rPr>
           <w:rStyle w:val="VerbatimChar"/>
         </w:rPr>
-        <w:t xml:space="preserve">VLAN 20</w:t>
-      </w:r>
-      <w:r>
-        <w:t xml:space="preserve"> </w:t>
-      </w:r>
-      <w:r>
-        <w:t xml:space="preserve">похожа на последовательность в</w:t>
+        <w:t xml:space="preserve">C = ((N - 1) mod 2) + 1</w:t>
+      </w:r>
+    </w:p>
+    <w:p>
+      <w:pPr>
+        <w:pStyle w:val="FirstParagraph"/>
+      </w:pPr>
+      <w:r>
+        <w:t xml:space="preserve">Вариант</w:t>
       </w:r>
       <w:r>
         <w:t xml:space="preserve"> </w:t>
@@ -3935,52 +4707,186 @@
         <w:rPr>
           <w:rStyle w:val="VerbatimChar"/>
         </w:rPr>
-        <w:t xml:space="preserve">VLAN 10</w:t>
-      </w:r>
-      <w:r>
-        <w:t xml:space="preserve">;</w:t>
-      </w:r>
-    </w:p>
-    <w:p>
-      <w:pPr>
-        <w:pStyle w:val="Compact"/>
-        <w:numPr>
-          <w:ilvl w:val="0"/>
-          <w:numId w:val="1023"/>
-        </w:numPr>
-      </w:pPr>
-      <w:r>
-        <w:t xml:space="preserve">какие значения в кадрах отличаются;</w:t>
-      </w:r>
-    </w:p>
-    <w:p>
-      <w:pPr>
-        <w:pStyle w:val="Compact"/>
-        <w:numPr>
-          <w:ilvl w:val="0"/>
-          <w:numId w:val="1023"/>
-        </w:numPr>
-      </w:pPr>
-      <w:r>
-        <w:t xml:space="preserve">какое поле в кадре позволяет утверждать, что это уже другой логический сегмент.</w:t>
-      </w:r>
-    </w:p>
-    <w:bookmarkEnd w:id="46"/>
-    <w:bookmarkStart w:id="47" w:name="задание-4-аналитическая-часть"/>
-    <w:p>
-      <w:pPr>
-        <w:pStyle w:val="Heading3"/>
-      </w:pPr>
-      <w:r>
-        <w:t xml:space="preserve">Задание 4. Аналитическая часть</w:t>
-      </w:r>
-    </w:p>
-    <w:p>
-      <w:pPr>
-        <w:pStyle w:val="FirstParagraph"/>
-      </w:pPr>
-      <w:r>
-        <w:t xml:space="preserve">На основании захвата необходимо сделать выводы по следующим вопросам:</w:t>
+        <w:t xml:space="preserve">C</w:t>
+      </w:r>
+      <w:r>
+        <w:t xml:space="preserve">:</w:t>
+      </w:r>
+    </w:p>
+    <w:tbl>
+      <w:tblPr>
+        <w:tblStyle w:val="Table"/>
+        <w:tblW w:type="pct" w:w="5000"/>
+        <w:tblLayout w:type="fixed"/>
+        <w:tblLook w:firstRow="1" w:lastRow="0" w:firstColumn="0" w:lastColumn="0" w:noHBand="0" w:noVBand="0" w:val="0020"/>
+      </w:tblPr>
+      <w:tblGrid>
+        <w:gridCol w:w="3960"/>
+        <w:gridCol w:w="3960"/>
+      </w:tblGrid>
+      <w:tr>
+        <w:trPr>
+          <w:tblHeader w:val="on"/>
+        </w:trPr>
+        <w:tc>
+          <w:tcPr/>
+          <w:p>
+            <w:pPr>
+              <w:pStyle w:val="Compact"/>
+            </w:pPr>
+            <w:r>
+              <w:rPr>
+                <w:rStyle w:val="VerbatimChar"/>
+              </w:rPr>
+              <w:t xml:space="preserve">C</w:t>
+            </w:r>
+          </w:p>
+        </w:tc>
+        <w:tc>
+          <w:tcPr/>
+          <w:p>
+            <w:pPr>
+              <w:pStyle w:val="Compact"/>
+            </w:pPr>
+            <w:r>
+              <w:t xml:space="preserve">Обязательный сравнительный комментарий</w:t>
+            </w:r>
+          </w:p>
+        </w:tc>
+      </w:tr>
+      <w:tr>
+        <w:tc>
+          <w:tcPr/>
+          <w:p>
+            <w:pPr>
+              <w:pStyle w:val="Compact"/>
+            </w:pPr>
+            <w:r>
+              <w:rPr>
+                <w:rStyle w:val="VerbatimChar"/>
+              </w:rPr>
+              <w:t xml:space="preserve">1</w:t>
+            </w:r>
+          </w:p>
+        </w:tc>
+        <w:tc>
+          <w:tcPr/>
+          <w:p>
+            <w:pPr>
+              <w:pStyle w:val="Compact"/>
+            </w:pPr>
+            <w:r>
+              <w:t xml:space="preserve">сравнить, как в двух VLAN сохраняется одна и та же логика</w:t>
+            </w:r>
+            <w:r>
+              <w:t xml:space="preserve"> </w:t>
+            </w:r>
+            <w:r>
+              <w:rPr>
+                <w:rStyle w:val="VerbatimChar"/>
+              </w:rPr>
+              <w:t xml:space="preserve">ARP</w:t>
+            </w:r>
+            <w:r>
+              <w:t xml:space="preserve"> </w:t>
+            </w:r>
+            <w:r>
+              <w:t xml:space="preserve">и</w:t>
+            </w:r>
+            <w:r>
+              <w:t xml:space="preserve"> </w:t>
+            </w:r>
+            <w:r>
+              <w:rPr>
+                <w:rStyle w:val="VerbatimChar"/>
+              </w:rPr>
+              <w:t xml:space="preserve">ICMP</w:t>
+            </w:r>
+            <w:r>
+              <w:t xml:space="preserve">, но меняются адреса и</w:t>
+            </w:r>
+            <w:r>
+              <w:t xml:space="preserve"> </w:t>
+            </w:r>
+            <w:r>
+              <w:rPr>
+                <w:rStyle w:val="VerbatimChar"/>
+              </w:rPr>
+              <w:t xml:space="preserve">VLAN ID</w:t>
+            </w:r>
+          </w:p>
+        </w:tc>
+      </w:tr>
+      <w:tr>
+        <w:tc>
+          <w:tcPr/>
+          <w:p>
+            <w:pPr>
+              <w:pStyle w:val="Compact"/>
+            </w:pPr>
+            <w:r>
+              <w:rPr>
+                <w:rStyle w:val="VerbatimChar"/>
+              </w:rPr>
+              <w:t xml:space="preserve">2</w:t>
+            </w:r>
+          </w:p>
+        </w:tc>
+        <w:tc>
+          <w:tcPr/>
+          <w:p>
+            <w:pPr>
+              <w:pStyle w:val="Compact"/>
+            </w:pPr>
+            <w:r>
+              <w:t xml:space="preserve">сравнить, как один и тот же trunk переносит трафик двух VLAN, не смешивая логические сегменты</w:t>
+            </w:r>
+          </w:p>
+        </w:tc>
+      </w:tr>
+    </w:tbl>
+    <w:p>
+      <w:pPr>
+        <w:pStyle w:val="BodyText"/>
+      </w:pPr>
+      <w:r>
+        <w:t xml:space="preserve">После основного разбора перейди ко второй VLAN, то есть к той последовательности, которая</w:t>
+      </w:r>
+      <w:r>
+        <w:t xml:space="preserve"> </w:t>
+      </w:r>
+      <w:r>
+        <w:rPr>
+          <w:b/>
+          <w:bCs/>
+        </w:rPr>
+        <w:t xml:space="preserve">не</w:t>
+      </w:r>
+      <w:r>
+        <w:t xml:space="preserve"> </w:t>
+      </w:r>
+      <w:r>
+        <w:t xml:space="preserve">была выбрана основной по параметру</w:t>
+      </w:r>
+      <w:r>
+        <w:t xml:space="preserve"> </w:t>
+      </w:r>
+      <w:r>
+        <w:rPr>
+          <w:rStyle w:val="VerbatimChar"/>
+        </w:rPr>
+        <w:t xml:space="preserve">A</w:t>
+      </w:r>
+      <w:r>
+        <w:t xml:space="preserve">.</w:t>
+      </w:r>
+    </w:p>
+    <w:p>
+      <w:pPr>
+        <w:pStyle w:val="BodyText"/>
+      </w:pPr>
+      <w:r>
+        <w:t xml:space="preserve">Порядок выполнения:</w:t>
       </w:r>
     </w:p>
     <w:p>
@@ -3992,22 +4898,19 @@
         </w:numPr>
       </w:pPr>
       <w:r>
-        <w:t xml:space="preserve">почему</w:t>
-      </w:r>
-      <w:r>
-        <w:t xml:space="preserve"> </w:t>
+        <w:t xml:space="preserve">применить фильтр для второй VLAN (</w:t>
       </w:r>
       <w:r>
         <w:rPr>
           <w:rStyle w:val="VerbatimChar"/>
         </w:rPr>
-        <w:t xml:space="preserve">PC1</w:t>
+        <w:t xml:space="preserve">vlan.id == 10</w:t>
       </w:r>
       <w:r>
         <w:t xml:space="preserve"> </w:t>
       </w:r>
       <w:r>
-        <w:t xml:space="preserve">и</w:t>
+        <w:t xml:space="preserve">или</w:t>
       </w:r>
       <w:r>
         <w:t xml:space="preserve"> </w:t>
@@ -4016,13 +4919,25 @@
         <w:rPr>
           <w:rStyle w:val="VerbatimChar"/>
         </w:rPr>
-        <w:t xml:space="preserve">PC3</w:t>
+        <w:t xml:space="preserve">vlan.id == 20</w:t>
       </w:r>
       <w:r>
         <w:t xml:space="preserve"> </w:t>
       </w:r>
       <w:r>
-        <w:t xml:space="preserve">могут обмениваться кадрами через trunk;</w:t>
+        <w:t xml:space="preserve">в зависимости от значения</w:t>
+      </w:r>
+      <w:r>
+        <w:t xml:space="preserve"> </w:t>
+      </w:r>
+      <w:r>
+        <w:rPr>
+          <w:rStyle w:val="VerbatimChar"/>
+        </w:rPr>
+        <w:t xml:space="preserve">A</w:t>
+      </w:r>
+      <w:r>
+        <w:t xml:space="preserve">);</w:t>
       </w:r>
     </w:p>
     <w:p>
@@ -4034,7 +4949,7 @@
         </w:numPr>
       </w:pPr>
       <w:r>
-        <w:t xml:space="preserve">почему трафик</w:t>
+        <w:t xml:space="preserve">найти</w:t>
       </w:r>
       <w:r>
         <w:t xml:space="preserve"> </w:t>
@@ -4043,7 +4958,7 @@
         <w:rPr>
           <w:rStyle w:val="VerbatimChar"/>
         </w:rPr>
-        <w:t xml:space="preserve">VLAN 10</w:t>
+        <w:t xml:space="preserve">ARP Request</w:t>
       </w:r>
       <w:r>
         <w:t xml:space="preserve"> </w:t>
@@ -4058,13 +4973,10 @@
         <w:rPr>
           <w:rStyle w:val="VerbatimChar"/>
         </w:rPr>
-        <w:t xml:space="preserve">VLAN 20</w:t>
-      </w:r>
-      <w:r>
-        <w:t xml:space="preserve"> </w:t>
-      </w:r>
-      <w:r>
-        <w:t xml:space="preserve">не смешивается, хотя проходит по одному и тому же физическому линку;</w:t>
+        <w:t xml:space="preserve">ARP Reply</w:t>
+      </w:r>
+      <w:r>
+        <w:t xml:space="preserve">;</w:t>
       </w:r>
     </w:p>
     <w:p>
@@ -4076,7 +4988,34 @@
         </w:numPr>
       </w:pPr>
       <w:r>
-        <w:t xml:space="preserve">почему наличие trunk не отменяет логического разделения сети;</w:t>
+        <w:t xml:space="preserve">найти</w:t>
+      </w:r>
+      <w:r>
+        <w:t xml:space="preserve"> </w:t>
+      </w:r>
+      <w:r>
+        <w:rPr>
+          <w:rStyle w:val="VerbatimChar"/>
+        </w:rPr>
+        <w:t xml:space="preserve">ICMP Echo Request</w:t>
+      </w:r>
+      <w:r>
+        <w:t xml:space="preserve"> </w:t>
+      </w:r>
+      <w:r>
+        <w:t xml:space="preserve">и</w:t>
+      </w:r>
+      <w:r>
+        <w:t xml:space="preserve"> </w:t>
+      </w:r>
+      <w:r>
+        <w:rPr>
+          <w:rStyle w:val="VerbatimChar"/>
+        </w:rPr>
+        <w:t xml:space="preserve">ICMP Echo Reply</w:t>
+      </w:r>
+      <w:r>
+        <w:t xml:space="preserve">;</w:t>
       </w:r>
     </w:p>
     <w:p>
@@ -4088,7 +5027,55 @@
         </w:numPr>
       </w:pPr>
       <w:r>
-        <w:t xml:space="preserve">почему в этой лабораторной не требуется маршрутизатор.</w:t>
+        <w:t xml:space="preserve">выписать те же поля, что и для основной последовательности;</w:t>
+      </w:r>
+    </w:p>
+    <w:p>
+      <w:pPr>
+        <w:pStyle w:val="Compact"/>
+        <w:numPr>
+          <w:ilvl w:val="0"/>
+          <w:numId w:val="1024"/>
+        </w:numPr>
+      </w:pPr>
+      <w:r>
+        <w:t xml:space="preserve">подготовить сравнительную таблицу</w:t>
+      </w:r>
+      <w:r>
+        <w:t xml:space="preserve"> </w:t>
+      </w:r>
+      <w:r>
+        <w:rPr>
+          <w:rStyle w:val="VerbatimChar"/>
+        </w:rPr>
+        <w:t xml:space="preserve">основная VLAN ↔ вторая VLAN</w:t>
+      </w:r>
+      <w:r>
+        <w:t xml:space="preserve">;</w:t>
+      </w:r>
+    </w:p>
+    <w:p>
+      <w:pPr>
+        <w:pStyle w:val="Compact"/>
+        <w:numPr>
+          <w:ilvl w:val="0"/>
+          <w:numId w:val="1024"/>
+        </w:numPr>
+      </w:pPr>
+      <w:r>
+        <w:t xml:space="preserve">дать письменный комментарий по варианту</w:t>
+      </w:r>
+      <w:r>
+        <w:t xml:space="preserve"> </w:t>
+      </w:r>
+      <w:r>
+        <w:rPr>
+          <w:rStyle w:val="VerbatimChar"/>
+        </w:rPr>
+        <w:t xml:space="preserve">C</w:t>
+      </w:r>
+      <w:r>
+        <w:t xml:space="preserve">.</w:t>
       </w:r>
     </w:p>
     <w:p>
@@ -4096,7 +5083,7 @@
         <w:pStyle w:val="FirstParagraph"/>
       </w:pPr>
       <w:r>
-        <w:t xml:space="preserve">Итоговый вывод лабораторной работы должен содержать три обязательные мысли:</w:t>
+        <w:t xml:space="preserve">В отчёт по данному заданию включить:</w:t>
       </w:r>
     </w:p>
     <w:p>
@@ -4108,7 +5095,7 @@
         </w:numPr>
       </w:pPr>
       <w:r>
-        <w:t xml:space="preserve">VLAN разделяет сеть на отдельные широковещательные домены;</w:t>
+        <w:t xml:space="preserve">не менее 2 скриншотов Wireshark для второй VLAN;</w:t>
       </w:r>
     </w:p>
     <w:p>
@@ -4120,7 +5107,7 @@
         </w:numPr>
       </w:pPr>
       <w:r>
-        <w:t xml:space="preserve">trunk позволяет перенести несколько VLAN по одному физическому линку;</w:t>
+        <w:t xml:space="preserve">сравнительную таблицу по двум VLAN;</w:t>
       </w:r>
     </w:p>
     <w:p>
@@ -4132,7 +5119,186 @@
         </w:numPr>
       </w:pPr>
       <w:r>
-        <w:t xml:space="preserve">тег 802.1Q является наблюдаемым доказательством принадлежности кадра к конкретной VLAN.</w:t>
+        <w:t xml:space="preserve">комментарий по варианту</w:t>
+      </w:r>
+      <w:r>
+        <w:t xml:space="preserve"> </w:t>
+      </w:r>
+      <w:r>
+        <w:rPr>
+          <w:rStyle w:val="VerbatimChar"/>
+        </w:rPr>
+        <w:t xml:space="preserve">C</w:t>
+      </w:r>
+      <w:r>
+        <w:t xml:space="preserve">.</w:t>
+      </w:r>
+    </w:p>
+    <w:bookmarkEnd w:id="46"/>
+    <w:bookmarkStart w:id="47" w:name="задание-4-итоговая-аналитическая-часть"/>
+    <w:p>
+      <w:pPr>
+        <w:pStyle w:val="Heading3"/>
+      </w:pPr>
+      <w:r>
+        <w:t xml:space="preserve">Задание 4. Итоговая аналитическая часть</w:t>
+      </w:r>
+    </w:p>
+    <w:p>
+      <w:pPr>
+        <w:pStyle w:val="FirstParagraph"/>
+      </w:pPr>
+      <w:r>
+        <w:t xml:space="preserve">На основании захвата необходимо сделать выводы по следующим вопросам:</w:t>
+      </w:r>
+    </w:p>
+    <w:p>
+      <w:pPr>
+        <w:pStyle w:val="Compact"/>
+        <w:numPr>
+          <w:ilvl w:val="0"/>
+          <w:numId w:val="1026"/>
+        </w:numPr>
+      </w:pPr>
+      <w:r>
+        <w:t xml:space="preserve">почему хосты внутри одной VLAN могут обмениваться кадрами через trunk;</w:t>
+      </w:r>
+    </w:p>
+    <w:p>
+      <w:pPr>
+        <w:pStyle w:val="Compact"/>
+        <w:numPr>
+          <w:ilvl w:val="0"/>
+          <w:numId w:val="1026"/>
+        </w:numPr>
+      </w:pPr>
+      <w:r>
+        <w:t xml:space="preserve">почему трафик</w:t>
+      </w:r>
+      <w:r>
+        <w:t xml:space="preserve"> </w:t>
+      </w:r>
+      <w:r>
+        <w:rPr>
+          <w:rStyle w:val="VerbatimChar"/>
+        </w:rPr>
+        <w:t xml:space="preserve">VLAN 10</w:t>
+      </w:r>
+      <w:r>
+        <w:t xml:space="preserve"> </w:t>
+      </w:r>
+      <w:r>
+        <w:t xml:space="preserve">и</w:t>
+      </w:r>
+      <w:r>
+        <w:t xml:space="preserve"> </w:t>
+      </w:r>
+      <w:r>
+        <w:rPr>
+          <w:rStyle w:val="VerbatimChar"/>
+        </w:rPr>
+        <w:t xml:space="preserve">VLAN 20</w:t>
+      </w:r>
+      <w:r>
+        <w:t xml:space="preserve"> </w:t>
+      </w:r>
+      <w:r>
+        <w:t xml:space="preserve">не смешивается, хотя проходит по одному и тому же физическому линку;</w:t>
+      </w:r>
+    </w:p>
+    <w:p>
+      <w:pPr>
+        <w:pStyle w:val="Compact"/>
+        <w:numPr>
+          <w:ilvl w:val="0"/>
+          <w:numId w:val="1026"/>
+        </w:numPr>
+      </w:pPr>
+      <w:r>
+        <w:t xml:space="preserve">почему отсутствие маршрутизатора не позволяет организовать прямой обмен между двумя VLAN на третьем уровне;</w:t>
+      </w:r>
+    </w:p>
+    <w:p>
+      <w:pPr>
+        <w:pStyle w:val="Compact"/>
+        <w:numPr>
+          <w:ilvl w:val="0"/>
+          <w:numId w:val="1026"/>
+        </w:numPr>
+      </w:pPr>
+      <w:r>
+        <w:t xml:space="preserve">какие именно поля кадра в Wireshark являются наблюдаемым доказательством того, что trunk работает корректно.</w:t>
+      </w:r>
+    </w:p>
+    <w:p>
+      <w:pPr>
+        <w:pStyle w:val="FirstParagraph"/>
+      </w:pPr>
+      <w:r>
+        <w:t xml:space="preserve">Итоговый вывод лабораторной работы должен содержать четыре обязательные мысли:</w:t>
+      </w:r>
+    </w:p>
+    <w:p>
+      <w:pPr>
+        <w:pStyle w:val="Compact"/>
+        <w:numPr>
+          <w:ilvl w:val="0"/>
+          <w:numId w:val="1027"/>
+        </w:numPr>
+      </w:pPr>
+      <w:r>
+        <w:t xml:space="preserve">VLAN разделяет сеть на отдельные широковещательные домены;</w:t>
+      </w:r>
+    </w:p>
+    <w:p>
+      <w:pPr>
+        <w:pStyle w:val="Compact"/>
+        <w:numPr>
+          <w:ilvl w:val="0"/>
+          <w:numId w:val="1027"/>
+        </w:numPr>
+      </w:pPr>
+      <w:r>
+        <w:t xml:space="preserve">trunk позволяет перенести несколько VLAN по одному физическому линку;</w:t>
+      </w:r>
+    </w:p>
+    <w:p>
+      <w:pPr>
+        <w:pStyle w:val="Compact"/>
+        <w:numPr>
+          <w:ilvl w:val="0"/>
+          <w:numId w:val="1027"/>
+        </w:numPr>
+      </w:pPr>
+      <w:r>
+        <w:t xml:space="preserve">один физический линк может обслуживать несколько логических сегментов без смешивания их трафика;</w:t>
+      </w:r>
+    </w:p>
+    <w:p>
+      <w:pPr>
+        <w:pStyle w:val="Compact"/>
+        <w:numPr>
+          <w:ilvl w:val="0"/>
+          <w:numId w:val="1027"/>
+        </w:numPr>
+      </w:pPr>
+      <w:r>
+        <w:t xml:space="preserve">тег</w:t>
+      </w:r>
+      <w:r>
+        <w:t xml:space="preserve"> </w:t>
+      </w:r>
+      <w:r>
+        <w:rPr>
+          <w:rStyle w:val="VerbatimChar"/>
+        </w:rPr>
+        <w:t xml:space="preserve">802.1Q</w:t>
+      </w:r>
+      <w:r>
+        <w:t xml:space="preserve"> </w:t>
+      </w:r>
+      <w:r>
+        <w:t xml:space="preserve">является прямым наблюдаемым доказательством принадлежности кадра к конкретной VLAN.</w:t>
       </w:r>
     </w:p>
     <w:bookmarkEnd w:id="47"/>
@@ -4882,6 +6048,9 @@
     <w:abstractNumId w:val="991"/>
   </w:num>
   <w:num w:numId="1019">
+    <w:abstractNumId w:val="991"/>
+  </w:num>
+  <w:num w:numId="1020">
     <w:abstractNumId w:val="99411"/>
     <w:lvlOverride w:ilvl="0">
       <w:startOverride w:val="1"/>
@@ -4911,98 +6080,14 @@
       <w:startOverride w:val="1"/>
     </w:lvlOverride>
   </w:num>
-  <w:num w:numId="1020">
+  <w:num w:numId="1021">
     <w:abstractNumId w:val="991"/>
   </w:num>
-  <w:num w:numId="1021">
-    <w:abstractNumId w:val="99411"/>
-    <w:lvlOverride w:ilvl="0">
-      <w:startOverride w:val="1"/>
-    </w:lvlOverride>
-    <w:lvlOverride w:ilvl="1">
-      <w:startOverride w:val="1"/>
-    </w:lvlOverride>
-    <w:lvlOverride w:ilvl="2">
-      <w:startOverride w:val="1"/>
-    </w:lvlOverride>
-    <w:lvlOverride w:ilvl="3">
-      <w:startOverride w:val="1"/>
-    </w:lvlOverride>
-    <w:lvlOverride w:ilvl="4">
-      <w:startOverride w:val="1"/>
-    </w:lvlOverride>
-    <w:lvlOverride w:ilvl="5">
-      <w:startOverride w:val="1"/>
-    </w:lvlOverride>
-    <w:lvlOverride w:ilvl="6">
-      <w:startOverride w:val="1"/>
-    </w:lvlOverride>
-    <w:lvlOverride w:ilvl="7">
-      <w:startOverride w:val="1"/>
-    </w:lvlOverride>
-    <w:lvlOverride w:ilvl="8">
-      <w:startOverride w:val="1"/>
-    </w:lvlOverride>
-  </w:num>
   <w:num w:numId="1022">
-    <w:abstractNumId w:val="99411"/>
-    <w:lvlOverride w:ilvl="0">
-      <w:startOverride w:val="1"/>
-    </w:lvlOverride>
-    <w:lvlOverride w:ilvl="1">
-      <w:startOverride w:val="1"/>
-    </w:lvlOverride>
-    <w:lvlOverride w:ilvl="2">
-      <w:startOverride w:val="1"/>
-    </w:lvlOverride>
-    <w:lvlOverride w:ilvl="3">
-      <w:startOverride w:val="1"/>
-    </w:lvlOverride>
-    <w:lvlOverride w:ilvl="4">
-      <w:startOverride w:val="1"/>
-    </w:lvlOverride>
-    <w:lvlOverride w:ilvl="5">
-      <w:startOverride w:val="1"/>
-    </w:lvlOverride>
-    <w:lvlOverride w:ilvl="6">
-      <w:startOverride w:val="1"/>
-    </w:lvlOverride>
-    <w:lvlOverride w:ilvl="7">
-      <w:startOverride w:val="1"/>
-    </w:lvlOverride>
-    <w:lvlOverride w:ilvl="8">
-      <w:startOverride w:val="1"/>
-    </w:lvlOverride>
+    <w:abstractNumId w:val="991"/>
   </w:num>
   <w:num w:numId="1023">
-    <w:abstractNumId w:val="99411"/>
-    <w:lvlOverride w:ilvl="0">
-      <w:startOverride w:val="1"/>
-    </w:lvlOverride>
-    <w:lvlOverride w:ilvl="1">
-      <w:startOverride w:val="1"/>
-    </w:lvlOverride>
-    <w:lvlOverride w:ilvl="2">
-      <w:startOverride w:val="1"/>
-    </w:lvlOverride>
-    <w:lvlOverride w:ilvl="3">
-      <w:startOverride w:val="1"/>
-    </w:lvlOverride>
-    <w:lvlOverride w:ilvl="4">
-      <w:startOverride w:val="1"/>
-    </w:lvlOverride>
-    <w:lvlOverride w:ilvl="5">
-      <w:startOverride w:val="1"/>
-    </w:lvlOverride>
-    <w:lvlOverride w:ilvl="6">
-      <w:startOverride w:val="1"/>
-    </w:lvlOverride>
-    <w:lvlOverride w:ilvl="7">
-      <w:startOverride w:val="1"/>
-    </w:lvlOverride>
-    <w:lvlOverride w:ilvl="8">
-      <w:startOverride w:val="1"/>
-    </w:lvlOverride>
+    <w:abstractNumId w:val="991"/>
   </w:num>
   <w:num w:numId="1024">
     <w:abstractNumId w:val="99411"/>
@@ -5035,6 +6120,39 @@
     </w:lvlOverride>
   </w:num>
   <w:num w:numId="1025">
+    <w:abstractNumId w:val="991"/>
+  </w:num>
+  <w:num w:numId="1026">
+    <w:abstractNumId w:val="99411"/>
+    <w:lvlOverride w:ilvl="0">
+      <w:startOverride w:val="1"/>
+    </w:lvlOverride>
+    <w:lvlOverride w:ilvl="1">
+      <w:startOverride w:val="1"/>
+    </w:lvlOverride>
+    <w:lvlOverride w:ilvl="2">
+      <w:startOverride w:val="1"/>
+    </w:lvlOverride>
+    <w:lvlOverride w:ilvl="3">
+      <w:startOverride w:val="1"/>
+    </w:lvlOverride>
+    <w:lvlOverride w:ilvl="4">
+      <w:startOverride w:val="1"/>
+    </w:lvlOverride>
+    <w:lvlOverride w:ilvl="5">
+      <w:startOverride w:val="1"/>
+    </w:lvlOverride>
+    <w:lvlOverride w:ilvl="6">
+      <w:startOverride w:val="1"/>
+    </w:lvlOverride>
+    <w:lvlOverride w:ilvl="7">
+      <w:startOverride w:val="1"/>
+    </w:lvlOverride>
+    <w:lvlOverride w:ilvl="8">
+      <w:startOverride w:val="1"/>
+    </w:lvlOverride>
+  </w:num>
+  <w:num w:numId="1027">
     <w:abstractNumId w:val="991"/>
   </w:num>
 </w:numbering>
@@ -16898,6 +18016,232 @@
     <w:pPr>
       <w:wordWrap w:val="off"/>
     </w:pPr>
+  </w:style>
+  <w:style w:customStyle="1" w:styleId="KeywordTok" w:type="character">
+    <w:name w:val="KeywordTok"/>
+    <w:basedOn w:val="VerbatimChar"/>
+    <w:rPr>
+      <w:b/>
+      <w:color w:val="007020"/>
+    </w:rPr>
+  </w:style>
+  <w:style w:customStyle="1" w:styleId="DataTypeTok" w:type="character">
+    <w:name w:val="DataTypeTok"/>
+    <w:basedOn w:val="VerbatimChar"/>
+    <w:rPr>
+      <w:color w:val="902000"/>
+    </w:rPr>
+  </w:style>
+  <w:style w:customStyle="1" w:styleId="DecValTok" w:type="character">
+    <w:name w:val="DecValTok"/>
+    <w:basedOn w:val="VerbatimChar"/>
+    <w:rPr>
+      <w:color w:val="40a070"/>
+    </w:rPr>
+  </w:style>
+  <w:style w:customStyle="1" w:styleId="BaseNTok" w:type="character">
+    <w:name w:val="BaseNTok"/>
+    <w:basedOn w:val="VerbatimChar"/>
+    <w:rPr>
+      <w:color w:val="40a070"/>
+    </w:rPr>
+  </w:style>
+  <w:style w:customStyle="1" w:styleId="FloatTok" w:type="character">
+    <w:name w:val="FloatTok"/>
+    <w:basedOn w:val="VerbatimChar"/>
+    <w:rPr>
+      <w:color w:val="40a070"/>
+    </w:rPr>
+  </w:style>
+  <w:style w:customStyle="1" w:styleId="ConstantTok" w:type="character">
+    <w:name w:val="ConstantTok"/>
+    <w:basedOn w:val="VerbatimChar"/>
+    <w:rPr>
+      <w:color w:val="880000"/>
+    </w:rPr>
+  </w:style>
+  <w:style w:customStyle="1" w:styleId="CharTok" w:type="character">
+    <w:name w:val="CharTok"/>
+    <w:basedOn w:val="VerbatimChar"/>
+    <w:rPr>
+      <w:color w:val="4070a0"/>
+    </w:rPr>
+  </w:style>
+  <w:style w:customStyle="1" w:styleId="SpecialCharTok" w:type="character">
+    <w:name w:val="SpecialCharTok"/>
+    <w:basedOn w:val="VerbatimChar"/>
+    <w:rPr>
+      <w:color w:val="4070a0"/>
+    </w:rPr>
+  </w:style>
+  <w:style w:customStyle="1" w:styleId="StringTok" w:type="character">
+    <w:name w:val="StringTok"/>
+    <w:basedOn w:val="VerbatimChar"/>
+    <w:rPr>
+      <w:color w:val="4070a0"/>
+    </w:rPr>
+  </w:style>
+  <w:style w:customStyle="1" w:styleId="VerbatimStringTok" w:type="character">
+    <w:name w:val="VerbatimStringTok"/>
+    <w:basedOn w:val="VerbatimChar"/>
+    <w:rPr>
+      <w:color w:val="4070a0"/>
+    </w:rPr>
+  </w:style>
+  <w:style w:customStyle="1" w:styleId="SpecialStringTok" w:type="character">
+    <w:name w:val="SpecialStringTok"/>
+    <w:basedOn w:val="VerbatimChar"/>
+    <w:rPr>
+      <w:color w:val="bb6688"/>
+    </w:rPr>
+  </w:style>
+  <w:style w:customStyle="1" w:styleId="ImportTok" w:type="character">
+    <w:name w:val="ImportTok"/>
+    <w:basedOn w:val="VerbatimChar"/>
+    <w:rPr>
+      <w:b/>
+      <w:color w:val="008000"/>
+    </w:rPr>
+  </w:style>
+  <w:style w:customStyle="1" w:styleId="CommentTok" w:type="character">
+    <w:name w:val="CommentTok"/>
+    <w:basedOn w:val="VerbatimChar"/>
+    <w:rPr>
+      <w:i/>
+      <w:color w:val="60a0b0"/>
+    </w:rPr>
+  </w:style>
+  <w:style w:customStyle="1" w:styleId="DocumentationTok" w:type="character">
+    <w:name w:val="DocumentationTok"/>
+    <w:basedOn w:val="VerbatimChar"/>
+    <w:rPr>
+      <w:i/>
+      <w:color w:val="ba2121"/>
+    </w:rPr>
+  </w:style>
+  <w:style w:customStyle="1" w:styleId="AnnotationTok" w:type="character">
+    <w:name w:val="AnnotationTok"/>
+    <w:basedOn w:val="VerbatimChar"/>
+    <w:rPr>
+      <w:b/>
+      <w:i/>
+      <w:color w:val="60a0b0"/>
+    </w:rPr>
+  </w:style>
+  <w:style w:customStyle="1" w:styleId="CommentVarTok" w:type="character">
+    <w:name w:val="CommentVarTok"/>
+    <w:basedOn w:val="VerbatimChar"/>
+    <w:rPr>
+      <w:b/>
+      <w:i/>
+      <w:color w:val="60a0b0"/>
+    </w:rPr>
+  </w:style>
+  <w:style w:customStyle="1" w:styleId="OtherTok" w:type="character">
+    <w:name w:val="OtherTok"/>
+    <w:basedOn w:val="VerbatimChar"/>
+    <w:rPr>
+      <w:color w:val="007020"/>
+    </w:rPr>
+  </w:style>
+  <w:style w:customStyle="1" w:styleId="FunctionTok" w:type="character">
+    <w:name w:val="FunctionTok"/>
+    <w:basedOn w:val="VerbatimChar"/>
+    <w:rPr>
+      <w:color w:val="06287e"/>
+    </w:rPr>
+  </w:style>
+  <w:style w:customStyle="1" w:styleId="VariableTok" w:type="character">
+    <w:name w:val="VariableTok"/>
+    <w:basedOn w:val="VerbatimChar"/>
+    <w:rPr>
+      <w:color w:val="19177c"/>
+    </w:rPr>
+  </w:style>
+  <w:style w:customStyle="1" w:styleId="ControlFlowTok" w:type="character">
+    <w:name w:val="ControlFlowTok"/>
+    <w:basedOn w:val="VerbatimChar"/>
+    <w:rPr>
+      <w:b/>
+      <w:color w:val="007020"/>
+    </w:rPr>
+  </w:style>
+  <w:style w:customStyle="1" w:styleId="OperatorTok" w:type="character">
+    <w:name w:val="OperatorTok"/>
+    <w:basedOn w:val="VerbatimChar"/>
+    <w:rPr>
+      <w:color w:val="666666"/>
+    </w:rPr>
+  </w:style>
+  <w:style w:customStyle="1" w:styleId="BuiltInTok" w:type="character">
+    <w:name w:val="BuiltInTok"/>
+    <w:basedOn w:val="VerbatimChar"/>
+    <w:rPr>
+      <w:color w:val="008000"/>
+    </w:rPr>
+  </w:style>
+  <w:style w:customStyle="1" w:styleId="ExtensionTok" w:type="character">
+    <w:name w:val="ExtensionTok"/>
+    <w:basedOn w:val="VerbatimChar"/>
+    <w:rPr/>
+  </w:style>
+  <w:style w:customStyle="1" w:styleId="PreprocessorTok" w:type="character">
+    <w:name w:val="PreprocessorTok"/>
+    <w:basedOn w:val="VerbatimChar"/>
+    <w:rPr>
+      <w:color w:val="bc7a00"/>
+    </w:rPr>
+  </w:style>
+  <w:style w:customStyle="1" w:styleId="AttributeTok" w:type="character">
+    <w:name w:val="AttributeTok"/>
+    <w:basedOn w:val="VerbatimChar"/>
+    <w:rPr>
+      <w:color w:val="7d9029"/>
+    </w:rPr>
+  </w:style>
+  <w:style w:customStyle="1" w:styleId="RegionMarkerTok" w:type="character">
+    <w:name w:val="RegionMarkerTok"/>
+    <w:basedOn w:val="VerbatimChar"/>
+    <w:rPr/>
+  </w:style>
+  <w:style w:customStyle="1" w:styleId="InformationTok" w:type="character">
+    <w:name w:val="InformationTok"/>
+    <w:basedOn w:val="VerbatimChar"/>
+    <w:rPr>
+      <w:b/>
+      <w:i/>
+      <w:color w:val="60a0b0"/>
+    </w:rPr>
+  </w:style>
+  <w:style w:customStyle="1" w:styleId="WarningTok" w:type="character">
+    <w:name w:val="WarningTok"/>
+    <w:basedOn w:val="VerbatimChar"/>
+    <w:rPr>
+      <w:b/>
+      <w:i/>
+      <w:color w:val="60a0b0"/>
+    </w:rPr>
+  </w:style>
+  <w:style w:customStyle="1" w:styleId="AlertTok" w:type="character">
+    <w:name w:val="AlertTok"/>
+    <w:basedOn w:val="VerbatimChar"/>
+    <w:rPr>
+      <w:b/>
+      <w:color w:val="ff0000"/>
+    </w:rPr>
+  </w:style>
+  <w:style w:customStyle="1" w:styleId="ErrorTok" w:type="character">
+    <w:name w:val="ErrorTok"/>
+    <w:basedOn w:val="VerbatimChar"/>
+    <w:rPr>
+      <w:b/>
+      <w:color w:val="ff0000"/>
+    </w:rPr>
+  </w:style>
+  <w:style w:customStyle="1" w:styleId="NormalTok" w:type="character">
+    <w:name w:val="NormalTok"/>
+    <w:basedOn w:val="VerbatimChar"/>
+    <w:rPr/>
   </w:style>
   <w:style w:customStyle="1" w:styleId="KeywordTok" w:type="character">
     <w:name w:val="KeywordTok"/>

</xml_diff>

<commit_message>
Fix lab 3 and 4 variant layout
</commit_message>
<xml_diff>
--- a/LR3-VLAN-802.1Q/report.docx
+++ b/LR3-VLAN-802.1Q/report.docx
@@ -2,7 +2,7 @@
 <file path=word/document.xml><?xml version="1.0" encoding="utf-8"?>
 <w:document xmlns:w="http://schemas.openxmlformats.org/wordprocessingml/2006/main" xmlns:m="http://schemas.openxmlformats.org/officeDocument/2006/math" xmlns:r="http://schemas.openxmlformats.org/officeDocument/2006/relationships" xmlns:o="urn:schemas-microsoft-com:office:office" xmlns:v="urn:schemas-microsoft-com:vml" xmlns:w10="urn:schemas-microsoft-com:office:word" xmlns:a="http://schemas.openxmlformats.org/drawingml/2006/main" xmlns:pic="http://schemas.openxmlformats.org/drawingml/2006/picture" xmlns:wp="http://schemas.openxmlformats.org/drawingml/2006/wordprocessingDrawing">
   <w:body>
-    <w:bookmarkStart w:id="49" w:name="лабораторная-работа-3-логические-границы"/>
+    <w:bookmarkStart w:id="49" w:name="X6671cc2d6254ca437c571b64b9ef350e444b53e"/>
     <w:p>
       <w:pPr>
         <w:pStyle w:val="Heading1"/>
@@ -510,10 +510,7 @@
         <w:t xml:space="preserve">B</w:t>
       </w:r>
       <w:r>
-        <w:t xml:space="preserve"> </w:t>
-      </w:r>
-      <w:r>
-        <w:t xml:space="preserve">и</w:t>
+        <w:t xml:space="preserve">,</w:t>
       </w:r>
       <w:r>
         <w:t xml:space="preserve"> </w:t>
@@ -523,6 +520,21 @@
           <w:rStyle w:val="VerbatimChar"/>
         </w:rPr>
         <w:t xml:space="preserve">C</w:t>
+      </w:r>
+      <w:r>
+        <w:t xml:space="preserve"> </w:t>
+      </w:r>
+      <w:r>
+        <w:t xml:space="preserve">и</w:t>
+      </w:r>
+      <w:r>
+        <w:t xml:space="preserve"> </w:t>
+      </w:r>
+      <w:r>
+        <w:rPr>
+          <w:rStyle w:val="VerbatimChar"/>
+        </w:rPr>
+        <w:t xml:space="preserve">D</w:t>
       </w:r>
       <w:r>
         <w:t xml:space="preserve"> </w:t>
@@ -579,7 +591,7 @@
         </w:numPr>
       </w:pPr>
       <w:r>
-        <w:t xml:space="preserve">В этой лабораторной варианты не меняют сам файл захвата и не меняют адресный план: они задают основную последовательность для детального разбора и аналитический акцент в отчёте.</w:t>
+        <w:t xml:space="preserve">В этой лабораторной варианты не меняют сам файл захвата и не меняют адресный план: каждый параметр задаёт обязательный акцент внутри своего задания и влияет на содержание отчёта.</w:t>
       </w:r>
     </w:p>
     <w:p>
@@ -1099,7 +1111,7 @@
       </w:r>
     </w:p>
     <w:bookmarkEnd w:id="30"/>
-    <w:bookmarkStart w:id="31" w:name="стандарт-802.1q"/>
+    <w:bookmarkStart w:id="31" w:name="стандарт-8021q"/>
     <w:p>
       <w:pPr>
         <w:pStyle w:val="Heading4"/>
@@ -3086,6 +3098,18 @@
         <w:t xml:space="preserve">C</w:t>
       </w:r>
       <w:r>
+        <w:t xml:space="preserve">,</w:t>
+      </w:r>
+      <w:r>
+        <w:t xml:space="preserve"> </w:t>
+      </w:r>
+      <w:r>
+        <w:rPr>
+          <w:rStyle w:val="VerbatimChar"/>
+        </w:rPr>
+        <w:t xml:space="preserve">D</w:t>
+      </w:r>
+      <w:r>
         <w:t xml:space="preserve">;</w:t>
       </w:r>
     </w:p>
@@ -3209,6 +3233,30 @@
         </w:numPr>
       </w:pPr>
       <w:r>
+        <w:t xml:space="preserve">итоговый аналитический комментарий по варианту</w:t>
+      </w:r>
+      <w:r>
+        <w:t xml:space="preserve"> </w:t>
+      </w:r>
+      <w:r>
+        <w:rPr>
+          <w:rStyle w:val="VerbatimChar"/>
+        </w:rPr>
+        <w:t xml:space="preserve">D</w:t>
+      </w:r>
+      <w:r>
+        <w:t xml:space="preserve">;</w:t>
+      </w:r>
+    </w:p>
+    <w:p>
+      <w:pPr>
+        <w:pStyle w:val="Compact"/>
+        <w:numPr>
+          <w:ilvl w:val="0"/>
+          <w:numId w:val="1014"/>
+        </w:numPr>
+      </w:pPr>
+      <w:r>
         <w:t xml:space="preserve">краткий аналитический вывод.</w:t>
       </w:r>
     </w:p>
@@ -3393,8 +3441,7 @@
     <w:tbl>
       <w:tblPr>
         <w:tblStyle w:val="Table"/>
-        <w:tblW w:type="pct" w:w="5000"/>
-        <w:tblLayout w:type="fixed"/>
+        <w:tblW w:type="auto" w:w="0"/>
         <w:tblLook w:firstRow="1" w:lastRow="0" w:firstColumn="0" w:lastColumn="0" w:noHBand="0" w:noVBand="0" w:val="0020"/>
       </w:tblPr>
       <w:tblGrid>
@@ -4011,8 +4058,7 @@
     <w:tbl>
       <w:tblPr>
         <w:tblStyle w:val="Table"/>
-        <w:tblW w:type="pct" w:w="5000"/>
-        <w:tblLayout w:type="fixed"/>
+        <w:tblW w:type="auto" w:w="0"/>
         <w:tblLook w:firstRow="1" w:lastRow="0" w:firstColumn="0" w:lastColumn="0" w:noHBand="0" w:noVBand="0" w:val="0020"/>
       </w:tblPr>
       <w:tblGrid>
@@ -4716,8 +4762,7 @@
     <w:tbl>
       <w:tblPr>
         <w:tblStyle w:val="Table"/>
-        <w:tblW w:type="pct" w:w="5000"/>
-        <w:tblLayout w:type="fixed"/>
+        <w:tblW w:type="auto" w:w="0"/>
         <w:tblLook w:firstRow="1" w:lastRow="0" w:firstColumn="0" w:lastColumn="0" w:noHBand="0" w:noVBand="0" w:val="0020"/>
       </w:tblPr>
       <w:tblGrid>
@@ -5149,7 +5194,19 @@
         <w:pStyle w:val="FirstParagraph"/>
       </w:pPr>
       <w:r>
-        <w:t xml:space="preserve">На основании захвата необходимо сделать выводы по следующим вопросам:</w:t>
+        <w:t xml:space="preserve">Для этого задания используется параметр</w:t>
+      </w:r>
+      <w:r>
+        <w:t xml:space="preserve"> </w:t>
+      </w:r>
+      <w:r>
+        <w:rPr>
+          <w:rStyle w:val="VerbatimChar"/>
+        </w:rPr>
+        <w:t xml:space="preserve">D</w:t>
+      </w:r>
+      <w:r>
+        <w:t xml:space="preserve">, который вычисляется по формуле:</w:t>
       </w:r>
     </w:p>
     <w:p>
@@ -5161,34 +5218,18 @@
         </w:numPr>
       </w:pPr>
       <w:r>
-        <w:t xml:space="preserve">почему хосты внутри одной VLAN могут обмениваться кадрами через trunk;</w:t>
-      </w:r>
-    </w:p>
-    <w:p>
-      <w:pPr>
-        <w:pStyle w:val="Compact"/>
-        <w:numPr>
-          <w:ilvl w:val="0"/>
-          <w:numId w:val="1026"/>
-        </w:numPr>
-      </w:pPr>
-      <w:r>
-        <w:t xml:space="preserve">почему трафик</w:t>
-      </w:r>
-      <w:r>
-        <w:t xml:space="preserve"> </w:t>
-      </w:r>
-      <w:r>
         <w:rPr>
           <w:rStyle w:val="VerbatimChar"/>
         </w:rPr>
-        <w:t xml:space="preserve">VLAN 10</w:t>
-      </w:r>
-      <w:r>
-        <w:t xml:space="preserve"> </w:t>
-      </w:r>
-      <w:r>
-        <w:t xml:space="preserve">и</w:t>
+        <w:t xml:space="preserve">D = ((N - 1) mod 4) + 1</w:t>
+      </w:r>
+    </w:p>
+    <w:p>
+      <w:pPr>
+        <w:pStyle w:val="FirstParagraph"/>
+      </w:pPr>
+      <w:r>
+        <w:t xml:space="preserve">Вариант аналитического акцента по параметру</w:t>
       </w:r>
       <w:r>
         <w:t xml:space="preserve"> </w:t>
@@ -5197,45 +5238,245 @@
         <w:rPr>
           <w:rStyle w:val="VerbatimChar"/>
         </w:rPr>
-        <w:t xml:space="preserve">VLAN 20</w:t>
-      </w:r>
-      <w:r>
-        <w:t xml:space="preserve"> </w:t>
-      </w:r>
-      <w:r>
-        <w:t xml:space="preserve">не смешивается, хотя проходит по одному и тому же физическому линку;</w:t>
-      </w:r>
-    </w:p>
-    <w:p>
-      <w:pPr>
-        <w:pStyle w:val="Compact"/>
-        <w:numPr>
-          <w:ilvl w:val="0"/>
-          <w:numId w:val="1026"/>
-        </w:numPr>
-      </w:pPr>
-      <w:r>
-        <w:t xml:space="preserve">почему отсутствие маршрутизатора не позволяет организовать прямой обмен между двумя VLAN на третьем уровне;</w:t>
-      </w:r>
-    </w:p>
-    <w:p>
-      <w:pPr>
-        <w:pStyle w:val="Compact"/>
-        <w:numPr>
-          <w:ilvl w:val="0"/>
-          <w:numId w:val="1026"/>
-        </w:numPr>
-      </w:pPr>
-      <w:r>
-        <w:t xml:space="preserve">какие именно поля кадра в Wireshark являются наблюдаемым доказательством того, что trunk работает корректно.</w:t>
-      </w:r>
-    </w:p>
-    <w:p>
-      <w:pPr>
-        <w:pStyle w:val="FirstParagraph"/>
-      </w:pPr>
-      <w:r>
-        <w:t xml:space="preserve">Итоговый вывод лабораторной работы должен содержать четыре обязательные мысли:</w:t>
+        <w:t xml:space="preserve">D</w:t>
+      </w:r>
+      <w:r>
+        <w:t xml:space="preserve">:</w:t>
+      </w:r>
+    </w:p>
+    <w:tbl>
+      <w:tblPr>
+        <w:tblStyle w:val="Table"/>
+        <w:tblW w:type="auto" w:w="0"/>
+        <w:tblLook w:firstRow="1" w:lastRow="0" w:firstColumn="0" w:lastColumn="0" w:noHBand="0" w:noVBand="0" w:val="0020"/>
+      </w:tblPr>
+      <w:tblGrid>
+        <w:gridCol w:w="3960"/>
+        <w:gridCol w:w="3960"/>
+      </w:tblGrid>
+      <w:tr>
+        <w:trPr>
+          <w:tblHeader w:val="on"/>
+        </w:trPr>
+        <w:tc>
+          <w:tcPr/>
+          <w:p>
+            <w:pPr>
+              <w:pStyle w:val="Compact"/>
+            </w:pPr>
+            <w:r>
+              <w:rPr>
+                <w:rStyle w:val="VerbatimChar"/>
+              </w:rPr>
+              <w:t xml:space="preserve">D</w:t>
+            </w:r>
+          </w:p>
+        </w:tc>
+        <w:tc>
+          <w:tcPr/>
+          <w:p>
+            <w:pPr>
+              <w:pStyle w:val="Compact"/>
+            </w:pPr>
+            <w:r>
+              <w:t xml:space="preserve">Обязательный расширенный комментарий</w:t>
+            </w:r>
+          </w:p>
+        </w:tc>
+      </w:tr>
+      <w:tr>
+        <w:tc>
+          <w:tcPr/>
+          <w:p>
+            <w:pPr>
+              <w:pStyle w:val="Compact"/>
+            </w:pPr>
+            <w:r>
+              <w:rPr>
+                <w:rStyle w:val="VerbatimChar"/>
+              </w:rPr>
+              <w:t xml:space="preserve">1</w:t>
+            </w:r>
+          </w:p>
+        </w:tc>
+        <w:tc>
+          <w:tcPr/>
+          <w:p>
+            <w:pPr>
+              <w:pStyle w:val="Compact"/>
+            </w:pPr>
+            <w:r>
+              <w:t xml:space="preserve">пояснить, почему один trunk переносит трафик нескольких VLAN, но не объединяет их в один широковещательный домен</w:t>
+            </w:r>
+          </w:p>
+        </w:tc>
+      </w:tr>
+      <w:tr>
+        <w:tc>
+          <w:tcPr/>
+          <w:p>
+            <w:pPr>
+              <w:pStyle w:val="Compact"/>
+            </w:pPr>
+            <w:r>
+              <w:rPr>
+                <w:rStyle w:val="VerbatimChar"/>
+              </w:rPr>
+              <w:t xml:space="preserve">2</w:t>
+            </w:r>
+          </w:p>
+        </w:tc>
+        <w:tc>
+          <w:tcPr/>
+          <w:p>
+            <w:pPr>
+              <w:pStyle w:val="Compact"/>
+            </w:pPr>
+            <w:r>
+              <w:t xml:space="preserve">пояснить, почему в захвате отсутствует межсетевой обмен между</w:t>
+            </w:r>
+            <w:r>
+              <w:t xml:space="preserve"> </w:t>
+            </w:r>
+            <w:r>
+              <w:rPr>
+                <w:rStyle w:val="VerbatimChar"/>
+              </w:rPr>
+              <w:t xml:space="preserve">VLAN 10</w:t>
+            </w:r>
+            <w:r>
+              <w:t xml:space="preserve"> </w:t>
+            </w:r>
+            <w:r>
+              <w:t xml:space="preserve">и</w:t>
+            </w:r>
+            <w:r>
+              <w:t xml:space="preserve"> </w:t>
+            </w:r>
+            <w:r>
+              <w:rPr>
+                <w:rStyle w:val="VerbatimChar"/>
+              </w:rPr>
+              <w:t xml:space="preserve">VLAN 20</w:t>
+            </w:r>
+            <w:r>
+              <w:t xml:space="preserve">, хотя внутри каждой VLAN есть связность</w:t>
+            </w:r>
+          </w:p>
+        </w:tc>
+      </w:tr>
+      <w:tr>
+        <w:tc>
+          <w:tcPr/>
+          <w:p>
+            <w:pPr>
+              <w:pStyle w:val="Compact"/>
+            </w:pPr>
+            <w:r>
+              <w:rPr>
+                <w:rStyle w:val="VerbatimChar"/>
+              </w:rPr>
+              <w:t xml:space="preserve">3</w:t>
+            </w:r>
+          </w:p>
+        </w:tc>
+        <w:tc>
+          <w:tcPr/>
+          <w:p>
+            <w:pPr>
+              <w:pStyle w:val="Compact"/>
+            </w:pPr>
+            <w:r>
+              <w:t xml:space="preserve">показать, как одинаковая логика</w:t>
+            </w:r>
+            <w:r>
+              <w:t xml:space="preserve"> </w:t>
+            </w:r>
+            <w:r>
+              <w:rPr>
+                <w:rStyle w:val="VerbatimChar"/>
+              </w:rPr>
+              <w:t xml:space="preserve">ARP</w:t>
+            </w:r>
+            <w:r>
+              <w:t xml:space="preserve"> </w:t>
+            </w:r>
+            <w:r>
+              <w:t xml:space="preserve">и</w:t>
+            </w:r>
+            <w:r>
+              <w:t xml:space="preserve"> </w:t>
+            </w:r>
+            <w:r>
+              <w:rPr>
+                <w:rStyle w:val="VerbatimChar"/>
+              </w:rPr>
+              <w:t xml:space="preserve">ICMP</w:t>
+            </w:r>
+            <w:r>
+              <w:t xml:space="preserve"> </w:t>
+            </w:r>
+            <w:r>
+              <w:t xml:space="preserve">повторяется в двух VLAN при изменении только адресов и</w:t>
+            </w:r>
+            <w:r>
+              <w:t xml:space="preserve"> </w:t>
+            </w:r>
+            <w:r>
+              <w:rPr>
+                <w:rStyle w:val="VerbatimChar"/>
+              </w:rPr>
+              <w:t xml:space="preserve">VLAN ID</w:t>
+            </w:r>
+          </w:p>
+        </w:tc>
+      </w:tr>
+      <w:tr>
+        <w:tc>
+          <w:tcPr/>
+          <w:p>
+            <w:pPr>
+              <w:pStyle w:val="Compact"/>
+            </w:pPr>
+            <w:r>
+              <w:rPr>
+                <w:rStyle w:val="VerbatimChar"/>
+              </w:rPr>
+              <w:t xml:space="preserve">4</w:t>
+            </w:r>
+          </w:p>
+        </w:tc>
+        <w:tc>
+          <w:tcPr/>
+          <w:p>
+            <w:pPr>
+              <w:pStyle w:val="Compact"/>
+            </w:pPr>
+            <w:r>
+              <w:t xml:space="preserve">объяснить, почему именно захват на trunk-линке позволяет доказать и наличие тегирования</w:t>
+            </w:r>
+            <w:r>
+              <w:t xml:space="preserve"> </w:t>
+            </w:r>
+            <w:r>
+              <w:rPr>
+                <w:rStyle w:val="VerbatimChar"/>
+              </w:rPr>
+              <w:t xml:space="preserve">802.1Q</w:t>
+            </w:r>
+            <w:r>
+              <w:t xml:space="preserve">, и раздельность логических сегментов</w:t>
+            </w:r>
+          </w:p>
+        </w:tc>
+      </w:tr>
+    </w:tbl>
+    <w:p>
+      <w:pPr>
+        <w:pStyle w:val="BodyText"/>
+      </w:pPr>
+      <w:r>
+        <w:t xml:space="preserve">На основании захвата необходимо сделать выводы по следующим вопросам:</w:t>
       </w:r>
     </w:p>
     <w:p>
@@ -5247,7 +5488,7 @@
         </w:numPr>
       </w:pPr>
       <w:r>
-        <w:t xml:space="preserve">VLAN разделяет сеть на отдельные широковещательные домены;</w:t>
+        <w:t xml:space="preserve">почему хосты внутри одной VLAN могут обмениваться кадрами через trunk;</w:t>
       </w:r>
     </w:p>
     <w:p>
@@ -5259,7 +5500,37 @@
         </w:numPr>
       </w:pPr>
       <w:r>
-        <w:t xml:space="preserve">trunk позволяет перенести несколько VLAN по одному физическому линку;</w:t>
+        <w:t xml:space="preserve">почему трафик</w:t>
+      </w:r>
+      <w:r>
+        <w:t xml:space="preserve"> </w:t>
+      </w:r>
+      <w:r>
+        <w:rPr>
+          <w:rStyle w:val="VerbatimChar"/>
+        </w:rPr>
+        <w:t xml:space="preserve">VLAN 10</w:t>
+      </w:r>
+      <w:r>
+        <w:t xml:space="preserve"> </w:t>
+      </w:r>
+      <w:r>
+        <w:t xml:space="preserve">и</w:t>
+      </w:r>
+      <w:r>
+        <w:t xml:space="preserve"> </w:t>
+      </w:r>
+      <w:r>
+        <w:rPr>
+          <w:rStyle w:val="VerbatimChar"/>
+        </w:rPr>
+        <w:t xml:space="preserve">VLAN 20</w:t>
+      </w:r>
+      <w:r>
+        <w:t xml:space="preserve"> </w:t>
+      </w:r>
+      <w:r>
+        <w:t xml:space="preserve">не смешивается, хотя проходит по одному и тому же физическому линку;</w:t>
       </w:r>
     </w:p>
     <w:p>
@@ -5271,7 +5542,7 @@
         </w:numPr>
       </w:pPr>
       <w:r>
-        <w:t xml:space="preserve">один физический линк может обслуживать несколько логических сегментов без смешивания их трафика;</w:t>
+        <w:t xml:space="preserve">почему отсутствие маршрутизатора не позволяет организовать прямой обмен между двумя VLAN на третьем уровне;</w:t>
       </w:r>
     </w:p>
     <w:p>
@@ -5283,6 +5554,82 @@
         </w:numPr>
       </w:pPr>
       <w:r>
+        <w:t xml:space="preserve">какие именно поля кадра в Wireshark являются наблюдаемым доказательством того, что trunk работает корректно.</w:t>
+      </w:r>
+    </w:p>
+    <w:p>
+      <w:pPr>
+        <w:pStyle w:val="FirstParagraph"/>
+      </w:pPr>
+      <w:r>
+        <w:t xml:space="preserve">Дополнительно необходимо выполнить аналитический пункт по варианту</w:t>
+      </w:r>
+      <w:r>
+        <w:t xml:space="preserve"> </w:t>
+      </w:r>
+      <w:r>
+        <w:rPr>
+          <w:rStyle w:val="VerbatimChar"/>
+        </w:rPr>
+        <w:t xml:space="preserve">D</w:t>
+      </w:r>
+      <w:r>
+        <w:t xml:space="preserve">.</w:t>
+      </w:r>
+    </w:p>
+    <w:p>
+      <w:pPr>
+        <w:pStyle w:val="BodyText"/>
+      </w:pPr>
+      <w:r>
+        <w:t xml:space="preserve">Итоговый вывод лабораторной работы должен содержать четыре обязательные мысли:</w:t>
+      </w:r>
+    </w:p>
+    <w:p>
+      <w:pPr>
+        <w:pStyle w:val="Compact"/>
+        <w:numPr>
+          <w:ilvl w:val="0"/>
+          <w:numId w:val="1028"/>
+        </w:numPr>
+      </w:pPr>
+      <w:r>
+        <w:t xml:space="preserve">VLAN разделяет сеть на отдельные широковещательные домены;</w:t>
+      </w:r>
+    </w:p>
+    <w:p>
+      <w:pPr>
+        <w:pStyle w:val="Compact"/>
+        <w:numPr>
+          <w:ilvl w:val="0"/>
+          <w:numId w:val="1028"/>
+        </w:numPr>
+      </w:pPr>
+      <w:r>
+        <w:t xml:space="preserve">trunk позволяет перенести несколько VLAN по одному физическому линку;</w:t>
+      </w:r>
+    </w:p>
+    <w:p>
+      <w:pPr>
+        <w:pStyle w:val="Compact"/>
+        <w:numPr>
+          <w:ilvl w:val="0"/>
+          <w:numId w:val="1028"/>
+        </w:numPr>
+      </w:pPr>
+      <w:r>
+        <w:t xml:space="preserve">один физический линк может обслуживать несколько логических сегментов без смешивания их трафика;</w:t>
+      </w:r>
+    </w:p>
+    <w:p>
+      <w:pPr>
+        <w:pStyle w:val="Compact"/>
+        <w:numPr>
+          <w:ilvl w:val="0"/>
+          <w:numId w:val="1028"/>
+        </w:numPr>
+      </w:pPr>
+      <w:r>
         <w:t xml:space="preserve">тег</w:t>
       </w:r>
       <w:r>
@@ -5299,6 +5646,62 @@
       </w:r>
       <w:r>
         <w:t xml:space="preserve">является прямым наблюдаемым доказательством принадлежности кадра к конкретной VLAN.</w:t>
+      </w:r>
+    </w:p>
+    <w:p>
+      <w:pPr>
+        <w:pStyle w:val="FirstParagraph"/>
+      </w:pPr>
+      <w:r>
+        <w:t xml:space="preserve">В отчёт по данному заданию включить:</w:t>
+      </w:r>
+    </w:p>
+    <w:p>
+      <w:pPr>
+        <w:pStyle w:val="Compact"/>
+        <w:numPr>
+          <w:ilvl w:val="0"/>
+          <w:numId w:val="1029"/>
+        </w:numPr>
+      </w:pPr>
+      <w:r>
+        <w:t xml:space="preserve">письменные ответы на четыре обязательных вопроса;</w:t>
+      </w:r>
+    </w:p>
+    <w:p>
+      <w:pPr>
+        <w:pStyle w:val="Compact"/>
+        <w:numPr>
+          <w:ilvl w:val="0"/>
+          <w:numId w:val="1029"/>
+        </w:numPr>
+      </w:pPr>
+      <w:r>
+        <w:t xml:space="preserve">отдельный развёрнутый комментарий по варианту</w:t>
+      </w:r>
+      <w:r>
+        <w:t xml:space="preserve"> </w:t>
+      </w:r>
+      <w:r>
+        <w:rPr>
+          <w:rStyle w:val="VerbatimChar"/>
+        </w:rPr>
+        <w:t xml:space="preserve">D</w:t>
+      </w:r>
+      <w:r>
+        <w:t xml:space="preserve">;</w:t>
+      </w:r>
+    </w:p>
+    <w:p>
+      <w:pPr>
+        <w:pStyle w:val="Compact"/>
+        <w:numPr>
+          <w:ilvl w:val="0"/>
+          <w:numId w:val="1029"/>
+        </w:numPr>
+      </w:pPr>
+      <w:r>
+        <w:t xml:space="preserve">итоговый вывод лабораторной работы.</w:t>
       </w:r>
     </w:p>
     <w:bookmarkEnd w:id="47"/>
@@ -6123,6 +6526,9 @@
     <w:abstractNumId w:val="991"/>
   </w:num>
   <w:num w:numId="1026">
+    <w:abstractNumId w:val="991"/>
+  </w:num>
+  <w:num w:numId="1027">
     <w:abstractNumId w:val="99411"/>
     <w:lvlOverride w:ilvl="0">
       <w:startOverride w:val="1"/>
@@ -6152,7 +6558,10 @@
       <w:startOverride w:val="1"/>
     </w:lvlOverride>
   </w:num>
-  <w:num w:numId="1027">
+  <w:num w:numId="1028">
+    <w:abstractNumId w:val="991"/>
+  </w:num>
+  <w:num w:numId="1029">
     <w:abstractNumId w:val="991"/>
   </w:num>
 </w:numbering>
@@ -18016,6 +18425,232 @@
     <w:pPr>
       <w:wordWrap w:val="off"/>
     </w:pPr>
+  </w:style>
+  <w:style w:customStyle="1" w:styleId="KeywordTok" w:type="character">
+    <w:name w:val="KeywordTok"/>
+    <w:basedOn w:val="VerbatimChar"/>
+    <w:rPr>
+      <w:b/>
+      <w:color w:val="007020"/>
+    </w:rPr>
+  </w:style>
+  <w:style w:customStyle="1" w:styleId="DataTypeTok" w:type="character">
+    <w:name w:val="DataTypeTok"/>
+    <w:basedOn w:val="VerbatimChar"/>
+    <w:rPr>
+      <w:color w:val="902000"/>
+    </w:rPr>
+  </w:style>
+  <w:style w:customStyle="1" w:styleId="DecValTok" w:type="character">
+    <w:name w:val="DecValTok"/>
+    <w:basedOn w:val="VerbatimChar"/>
+    <w:rPr>
+      <w:color w:val="40a070"/>
+    </w:rPr>
+  </w:style>
+  <w:style w:customStyle="1" w:styleId="BaseNTok" w:type="character">
+    <w:name w:val="BaseNTok"/>
+    <w:basedOn w:val="VerbatimChar"/>
+    <w:rPr>
+      <w:color w:val="40a070"/>
+    </w:rPr>
+  </w:style>
+  <w:style w:customStyle="1" w:styleId="FloatTok" w:type="character">
+    <w:name w:val="FloatTok"/>
+    <w:basedOn w:val="VerbatimChar"/>
+    <w:rPr>
+      <w:color w:val="40a070"/>
+    </w:rPr>
+  </w:style>
+  <w:style w:customStyle="1" w:styleId="ConstantTok" w:type="character">
+    <w:name w:val="ConstantTok"/>
+    <w:basedOn w:val="VerbatimChar"/>
+    <w:rPr>
+      <w:color w:val="880000"/>
+    </w:rPr>
+  </w:style>
+  <w:style w:customStyle="1" w:styleId="CharTok" w:type="character">
+    <w:name w:val="CharTok"/>
+    <w:basedOn w:val="VerbatimChar"/>
+    <w:rPr>
+      <w:color w:val="4070a0"/>
+    </w:rPr>
+  </w:style>
+  <w:style w:customStyle="1" w:styleId="SpecialCharTok" w:type="character">
+    <w:name w:val="SpecialCharTok"/>
+    <w:basedOn w:val="VerbatimChar"/>
+    <w:rPr>
+      <w:color w:val="4070a0"/>
+    </w:rPr>
+  </w:style>
+  <w:style w:customStyle="1" w:styleId="StringTok" w:type="character">
+    <w:name w:val="StringTok"/>
+    <w:basedOn w:val="VerbatimChar"/>
+    <w:rPr>
+      <w:color w:val="4070a0"/>
+    </w:rPr>
+  </w:style>
+  <w:style w:customStyle="1" w:styleId="VerbatimStringTok" w:type="character">
+    <w:name w:val="VerbatimStringTok"/>
+    <w:basedOn w:val="VerbatimChar"/>
+    <w:rPr>
+      <w:color w:val="4070a0"/>
+    </w:rPr>
+  </w:style>
+  <w:style w:customStyle="1" w:styleId="SpecialStringTok" w:type="character">
+    <w:name w:val="SpecialStringTok"/>
+    <w:basedOn w:val="VerbatimChar"/>
+    <w:rPr>
+      <w:color w:val="bb6688"/>
+    </w:rPr>
+  </w:style>
+  <w:style w:customStyle="1" w:styleId="ImportTok" w:type="character">
+    <w:name w:val="ImportTok"/>
+    <w:basedOn w:val="VerbatimChar"/>
+    <w:rPr>
+      <w:b/>
+      <w:color w:val="008000"/>
+    </w:rPr>
+  </w:style>
+  <w:style w:customStyle="1" w:styleId="CommentTok" w:type="character">
+    <w:name w:val="CommentTok"/>
+    <w:basedOn w:val="VerbatimChar"/>
+    <w:rPr>
+      <w:i/>
+      <w:color w:val="60a0b0"/>
+    </w:rPr>
+  </w:style>
+  <w:style w:customStyle="1" w:styleId="DocumentationTok" w:type="character">
+    <w:name w:val="DocumentationTok"/>
+    <w:basedOn w:val="VerbatimChar"/>
+    <w:rPr>
+      <w:i/>
+      <w:color w:val="ba2121"/>
+    </w:rPr>
+  </w:style>
+  <w:style w:customStyle="1" w:styleId="AnnotationTok" w:type="character">
+    <w:name w:val="AnnotationTok"/>
+    <w:basedOn w:val="VerbatimChar"/>
+    <w:rPr>
+      <w:b/>
+      <w:i/>
+      <w:color w:val="60a0b0"/>
+    </w:rPr>
+  </w:style>
+  <w:style w:customStyle="1" w:styleId="CommentVarTok" w:type="character">
+    <w:name w:val="CommentVarTok"/>
+    <w:basedOn w:val="VerbatimChar"/>
+    <w:rPr>
+      <w:b/>
+      <w:i/>
+      <w:color w:val="60a0b0"/>
+    </w:rPr>
+  </w:style>
+  <w:style w:customStyle="1" w:styleId="OtherTok" w:type="character">
+    <w:name w:val="OtherTok"/>
+    <w:basedOn w:val="VerbatimChar"/>
+    <w:rPr>
+      <w:color w:val="007020"/>
+    </w:rPr>
+  </w:style>
+  <w:style w:customStyle="1" w:styleId="FunctionTok" w:type="character">
+    <w:name w:val="FunctionTok"/>
+    <w:basedOn w:val="VerbatimChar"/>
+    <w:rPr>
+      <w:color w:val="06287e"/>
+    </w:rPr>
+  </w:style>
+  <w:style w:customStyle="1" w:styleId="VariableTok" w:type="character">
+    <w:name w:val="VariableTok"/>
+    <w:basedOn w:val="VerbatimChar"/>
+    <w:rPr>
+      <w:color w:val="19177c"/>
+    </w:rPr>
+  </w:style>
+  <w:style w:customStyle="1" w:styleId="ControlFlowTok" w:type="character">
+    <w:name w:val="ControlFlowTok"/>
+    <w:basedOn w:val="VerbatimChar"/>
+    <w:rPr>
+      <w:b/>
+      <w:color w:val="007020"/>
+    </w:rPr>
+  </w:style>
+  <w:style w:customStyle="1" w:styleId="OperatorTok" w:type="character">
+    <w:name w:val="OperatorTok"/>
+    <w:basedOn w:val="VerbatimChar"/>
+    <w:rPr>
+      <w:color w:val="666666"/>
+    </w:rPr>
+  </w:style>
+  <w:style w:customStyle="1" w:styleId="BuiltInTok" w:type="character">
+    <w:name w:val="BuiltInTok"/>
+    <w:basedOn w:val="VerbatimChar"/>
+    <w:rPr>
+      <w:color w:val="008000"/>
+    </w:rPr>
+  </w:style>
+  <w:style w:customStyle="1" w:styleId="ExtensionTok" w:type="character">
+    <w:name w:val="ExtensionTok"/>
+    <w:basedOn w:val="VerbatimChar"/>
+    <w:rPr/>
+  </w:style>
+  <w:style w:customStyle="1" w:styleId="PreprocessorTok" w:type="character">
+    <w:name w:val="PreprocessorTok"/>
+    <w:basedOn w:val="VerbatimChar"/>
+    <w:rPr>
+      <w:color w:val="bc7a00"/>
+    </w:rPr>
+  </w:style>
+  <w:style w:customStyle="1" w:styleId="AttributeTok" w:type="character">
+    <w:name w:val="AttributeTok"/>
+    <w:basedOn w:val="VerbatimChar"/>
+    <w:rPr>
+      <w:color w:val="7d9029"/>
+    </w:rPr>
+  </w:style>
+  <w:style w:customStyle="1" w:styleId="RegionMarkerTok" w:type="character">
+    <w:name w:val="RegionMarkerTok"/>
+    <w:basedOn w:val="VerbatimChar"/>
+    <w:rPr/>
+  </w:style>
+  <w:style w:customStyle="1" w:styleId="InformationTok" w:type="character">
+    <w:name w:val="InformationTok"/>
+    <w:basedOn w:val="VerbatimChar"/>
+    <w:rPr>
+      <w:b/>
+      <w:i/>
+      <w:color w:val="60a0b0"/>
+    </w:rPr>
+  </w:style>
+  <w:style w:customStyle="1" w:styleId="WarningTok" w:type="character">
+    <w:name w:val="WarningTok"/>
+    <w:basedOn w:val="VerbatimChar"/>
+    <w:rPr>
+      <w:b/>
+      <w:i/>
+      <w:color w:val="60a0b0"/>
+    </w:rPr>
+  </w:style>
+  <w:style w:customStyle="1" w:styleId="AlertTok" w:type="character">
+    <w:name w:val="AlertTok"/>
+    <w:basedOn w:val="VerbatimChar"/>
+    <w:rPr>
+      <w:b/>
+      <w:color w:val="ff0000"/>
+    </w:rPr>
+  </w:style>
+  <w:style w:customStyle="1" w:styleId="ErrorTok" w:type="character">
+    <w:name w:val="ErrorTok"/>
+    <w:basedOn w:val="VerbatimChar"/>
+    <w:rPr>
+      <w:b/>
+      <w:color w:val="ff0000"/>
+    </w:rPr>
+  </w:style>
+  <w:style w:customStyle="1" w:styleId="NormalTok" w:type="character">
+    <w:name w:val="NormalTok"/>
+    <w:basedOn w:val="VerbatimChar"/>
+    <w:rPr/>
   </w:style>
   <w:style w:customStyle="1" w:styleId="KeywordTok" w:type="character">
     <w:name w:val="KeywordTok"/>

</xml_diff>